<commit_message>
work 4: fix report
</commit_message>
<xml_diff>
--- a/work3/report3.docx
+++ b/work3/report3.docx
@@ -159,6 +159,7 @@
         <w:rPr>
           <w:b/>
           <w:sz w:val="28"/>
+          <w:lang w:val="en-US"/>
         </w:rPr>
       </w:pPr>
       <w:r>
@@ -174,7 +175,16 @@
           <w:spacing w:val="-5"/>
           <w:sz w:val="28"/>
         </w:rPr>
-        <w:t>№2</w:t>
+        <w:t>№</w:t>
+      </w:r>
+      <w:r>
+        <w:rPr>
+          <w:b/>
+          <w:spacing w:val="-5"/>
+          <w:sz w:val="28"/>
+          <w:lang w:val="en-US"/>
+        </w:rPr>
+        <w:t>3</w:t>
       </w:r>
     </w:p>
     <w:p>
@@ -1073,23 +1083,7 @@
         <w:jc w:val="both"/>
       </w:pPr>
       <w:r>
-        <w:t xml:space="preserve">Цель работы — закрепить навыки программирования CUDA и изучить применение разделяемой памяти при умножении матриц. Требуется реализовать </w:t>
-      </w:r>
-      <w:proofErr w:type="spellStart"/>
-      <w:r>
-        <w:t>kernel_matmul_shmem</w:t>
-      </w:r>
-      <w:proofErr w:type="spellEnd"/>
-      <w:r>
-        <w:t xml:space="preserve"> с передачей </w:t>
-      </w:r>
-      <w:proofErr w:type="spellStart"/>
-      <w:r>
-        <w:t>MatrixView</w:t>
-      </w:r>
-      <w:proofErr w:type="spellEnd"/>
-      <w:r>
-        <w:t xml:space="preserve"> по значению, обеспечить корректность результата, сравнить производительность с наивным ядром и проанализировать вычислительную сложность.</w:t>
+        <w:t>Цель работы — закрепить навыки программирования CUDA и изучить применение разделяемой памяти при умножении матриц. Требуется реализовать kernel_matmul_shmem с передачей MatrixView по значению, обеспечить корректность результата, сравнить производительность с наивным ядром и проанализировать вычислительную сложность.</w:t>
       </w:r>
     </w:p>
     <w:p>
@@ -1100,31 +1094,7 @@
         <w:jc w:val="both"/>
       </w:pPr>
       <w:r>
-        <w:t xml:space="preserve">Реализованы классы Data, </w:t>
-      </w:r>
-      <w:proofErr w:type="spellStart"/>
-      <w:r>
-        <w:t>MatrixView</w:t>
-      </w:r>
-      <w:proofErr w:type="spellEnd"/>
-      <w:r>
-        <w:t xml:space="preserve"> и Matrix. Оператор </w:t>
-      </w:r>
-      <w:proofErr w:type="spellStart"/>
-      <w:r>
-        <w:t>operator</w:t>
-      </w:r>
-      <w:proofErr w:type="spellEnd"/>
-      <w:r>
-        <w:t xml:space="preserve">* использует стратегию </w:t>
-      </w:r>
-      <w:proofErr w:type="spellStart"/>
-      <w:r>
-        <w:t>SharedMemory</w:t>
-      </w:r>
-      <w:proofErr w:type="spellEnd"/>
-      <w:r>
-        <w:t>; наивная реализация сохранена для контрольного сравнения. В обоих вариантах одна нить вычисляет один элемент матрицы результата, а блок содержит 16 × 16 нитей.</w:t>
+        <w:t>Реализованы классы Data, MatrixView и Matrix. Оператор operator* использует стратегию SharedMemory; наивная реализация сохранена для контрольного сравнения. В обоих вариантах одна нить вычисляет один элемент матрицы результата, а блок содержит 16 × 16 нитей.</w:t>
       </w:r>
     </w:p>
     <w:p>
@@ -1302,7 +1272,6 @@
         </w:rPr>
         <w:t xml:space="preserve">. Конструктор выделяет память с помощью </w:t>
       </w:r>
-      <w:proofErr w:type="spellStart"/>
       <w:r>
         <w:rPr>
           <w:rFonts w:eastAsia="MS Mincho"/>
@@ -1311,7 +1280,6 @@
         </w:rPr>
         <w:t>cudaMalloc</w:t>
       </w:r>
-      <w:proofErr w:type="spellEnd"/>
       <w:r>
         <w:rPr>
           <w:rFonts w:eastAsia="MS Mincho"/>
@@ -1319,7 +1287,6 @@
         </w:rPr>
         <w:t xml:space="preserve">, а деструктор освобождает её через </w:t>
       </w:r>
-      <w:proofErr w:type="spellStart"/>
       <w:r>
         <w:rPr>
           <w:rFonts w:eastAsia="MS Mincho"/>
@@ -1328,7 +1295,6 @@
         </w:rPr>
         <w:t>cudaFree</w:t>
       </w:r>
-      <w:proofErr w:type="spellEnd"/>
       <w:r>
         <w:rPr>
           <w:rFonts w:eastAsia="MS Mincho"/>
@@ -1415,9 +1381,8 @@
           <w:szCs w:val="28"/>
           <w:lang w:val="en-US"/>
         </w:rPr>
-        <w:t xml:space="preserve">explicit </w:t>
-      </w:r>
-      <w:proofErr w:type="gramStart"/>
+        <w:t>explicit Data(std::size_t size) : size_(size) {</w:t>
+      </w:r>
       <w:r>
         <w:rPr>
           <w:rFonts w:ascii="Consolas" w:hAnsi="Consolas"/>
@@ -1425,10 +1390,9 @@
           <w:szCs w:val="28"/>
           <w:lang w:val="en-US"/>
         </w:rPr>
-        <w:t>Data(std::</w:t>
-      </w:r>
-      <w:proofErr w:type="spellStart"/>
-      <w:proofErr w:type="gramEnd"/>
+        <w:br/>
+        <w:t xml:space="preserve">    if (size &gt; max_size / sizeof(T)) throw std::length_error("Data size overflow");</w:t>
+      </w:r>
       <w:r>
         <w:rPr>
           <w:rFonts w:ascii="Consolas" w:hAnsi="Consolas"/>
@@ -1436,239 +1400,8 @@
           <w:szCs w:val="28"/>
           <w:lang w:val="en-US"/>
         </w:rPr>
-        <w:t>size_t</w:t>
-      </w:r>
-      <w:proofErr w:type="spellEnd"/>
-      <w:r>
-        <w:rPr>
-          <w:rFonts w:ascii="Consolas" w:hAnsi="Consolas"/>
-          <w:sz w:val="20"/>
-          <w:szCs w:val="28"/>
-          <w:lang w:val="en-US"/>
-        </w:rPr>
-        <w:t xml:space="preserve"> size</w:t>
-      </w:r>
-      <w:proofErr w:type="gramStart"/>
-      <w:r>
-        <w:rPr>
-          <w:rFonts w:ascii="Consolas" w:hAnsi="Consolas"/>
-          <w:sz w:val="20"/>
-          <w:szCs w:val="28"/>
-          <w:lang w:val="en-US"/>
-        </w:rPr>
-        <w:t>) :</w:t>
-      </w:r>
-      <w:proofErr w:type="gramEnd"/>
-      <w:r>
-        <w:rPr>
-          <w:rFonts w:ascii="Consolas" w:hAnsi="Consolas"/>
-          <w:sz w:val="20"/>
-          <w:szCs w:val="28"/>
-          <w:lang w:val="en-US"/>
-        </w:rPr>
-        <w:t xml:space="preserve"> size_(size) {</w:t>
-      </w:r>
-      <w:r>
-        <w:rPr>
-          <w:rFonts w:ascii="Consolas" w:hAnsi="Consolas"/>
-          <w:sz w:val="20"/>
-          <w:szCs w:val="28"/>
-          <w:lang w:val="en-US"/>
-        </w:rPr>
         <w:br/>
-        <w:t xml:space="preserve">    if (size &gt; </w:t>
-      </w:r>
-      <w:proofErr w:type="spellStart"/>
-      <w:r>
-        <w:rPr>
-          <w:rFonts w:ascii="Consolas" w:hAnsi="Consolas"/>
-          <w:sz w:val="20"/>
-          <w:szCs w:val="28"/>
-          <w:lang w:val="en-US"/>
-        </w:rPr>
-        <w:t>max_size</w:t>
-      </w:r>
-      <w:proofErr w:type="spellEnd"/>
-      <w:r>
-        <w:rPr>
-          <w:rFonts w:ascii="Consolas" w:hAnsi="Consolas"/>
-          <w:sz w:val="20"/>
-          <w:szCs w:val="28"/>
-          <w:lang w:val="en-US"/>
-        </w:rPr>
-        <w:t xml:space="preserve"> / </w:t>
-      </w:r>
-      <w:proofErr w:type="spellStart"/>
-      <w:r>
-        <w:rPr>
-          <w:rFonts w:ascii="Consolas" w:hAnsi="Consolas"/>
-          <w:sz w:val="20"/>
-          <w:szCs w:val="28"/>
-          <w:lang w:val="en-US"/>
-        </w:rPr>
-        <w:t>sizeof</w:t>
-      </w:r>
-      <w:proofErr w:type="spellEnd"/>
-      <w:r>
-        <w:rPr>
-          <w:rFonts w:ascii="Consolas" w:hAnsi="Consolas"/>
-          <w:sz w:val="20"/>
-          <w:szCs w:val="28"/>
-          <w:lang w:val="en-US"/>
-        </w:rPr>
-        <w:t xml:space="preserve">(T)) throw </w:t>
-      </w:r>
-      <w:proofErr w:type="gramStart"/>
-      <w:r>
-        <w:rPr>
-          <w:rFonts w:ascii="Consolas" w:hAnsi="Consolas"/>
-          <w:sz w:val="20"/>
-          <w:szCs w:val="28"/>
-          <w:lang w:val="en-US"/>
-        </w:rPr>
-        <w:t>std::</w:t>
-      </w:r>
-      <w:proofErr w:type="spellStart"/>
-      <w:proofErr w:type="gramEnd"/>
-      <w:r>
-        <w:rPr>
-          <w:rFonts w:ascii="Consolas" w:hAnsi="Consolas"/>
-          <w:sz w:val="20"/>
-          <w:szCs w:val="28"/>
-          <w:lang w:val="en-US"/>
-        </w:rPr>
-        <w:t>length_</w:t>
-      </w:r>
-      <w:proofErr w:type="gramStart"/>
-      <w:r>
-        <w:rPr>
-          <w:rFonts w:ascii="Consolas" w:hAnsi="Consolas"/>
-          <w:sz w:val="20"/>
-          <w:szCs w:val="28"/>
-          <w:lang w:val="en-US"/>
-        </w:rPr>
-        <w:t>error</w:t>
-      </w:r>
-      <w:proofErr w:type="spellEnd"/>
-      <w:r>
-        <w:rPr>
-          <w:rFonts w:ascii="Consolas" w:hAnsi="Consolas"/>
-          <w:sz w:val="20"/>
-          <w:szCs w:val="28"/>
-          <w:lang w:val="en-US"/>
-        </w:rPr>
-        <w:t>(</w:t>
-      </w:r>
-      <w:proofErr w:type="gramEnd"/>
-      <w:r>
-        <w:rPr>
-          <w:rFonts w:ascii="Consolas" w:hAnsi="Consolas"/>
-          <w:sz w:val="20"/>
-          <w:szCs w:val="28"/>
-          <w:lang w:val="en-US"/>
-        </w:rPr>
-        <w:t>"Data size overflow");</w:t>
-      </w:r>
-      <w:r>
-        <w:rPr>
-          <w:rFonts w:ascii="Consolas" w:hAnsi="Consolas"/>
-          <w:sz w:val="20"/>
-          <w:szCs w:val="28"/>
-          <w:lang w:val="en-US"/>
-        </w:rPr>
-        <w:br/>
-        <w:t xml:space="preserve">    if (size_) CUDA_</w:t>
-      </w:r>
-      <w:proofErr w:type="gramStart"/>
-      <w:r>
-        <w:rPr>
-          <w:rFonts w:ascii="Consolas" w:hAnsi="Consolas"/>
-          <w:sz w:val="20"/>
-          <w:szCs w:val="28"/>
-          <w:lang w:val="en-US"/>
-        </w:rPr>
-        <w:t>CHECK(</w:t>
-      </w:r>
-      <w:proofErr w:type="spellStart"/>
-      <w:proofErr w:type="gramEnd"/>
-      <w:r>
-        <w:rPr>
-          <w:rFonts w:ascii="Consolas" w:hAnsi="Consolas"/>
-          <w:sz w:val="20"/>
-          <w:szCs w:val="28"/>
-          <w:lang w:val="en-US"/>
-        </w:rPr>
-        <w:t>cudaMalloc</w:t>
-      </w:r>
-      <w:proofErr w:type="spellEnd"/>
-      <w:r>
-        <w:rPr>
-          <w:rFonts w:ascii="Consolas" w:hAnsi="Consolas"/>
-          <w:sz w:val="20"/>
-          <w:szCs w:val="28"/>
-          <w:lang w:val="en-US"/>
-        </w:rPr>
-        <w:t>(</w:t>
-      </w:r>
-      <w:proofErr w:type="spellStart"/>
-      <w:r>
-        <w:rPr>
-          <w:rFonts w:ascii="Consolas" w:hAnsi="Consolas"/>
-          <w:sz w:val="20"/>
-          <w:szCs w:val="28"/>
-          <w:lang w:val="en-US"/>
-        </w:rPr>
-        <w:t>reinterpret_cast</w:t>
-      </w:r>
-      <w:proofErr w:type="spellEnd"/>
-      <w:r>
-        <w:rPr>
-          <w:rFonts w:ascii="Consolas" w:hAnsi="Consolas"/>
-          <w:sz w:val="20"/>
-          <w:szCs w:val="28"/>
-          <w:lang w:val="en-US"/>
-        </w:rPr>
-        <w:t>&lt;void**&gt;(&amp;</w:t>
-      </w:r>
-      <w:proofErr w:type="spellStart"/>
-      <w:r>
-        <w:rPr>
-          <w:rFonts w:ascii="Consolas" w:hAnsi="Consolas"/>
-          <w:sz w:val="20"/>
-          <w:szCs w:val="28"/>
-          <w:lang w:val="en-US"/>
-        </w:rPr>
-        <w:t>ptr</w:t>
-      </w:r>
-      <w:proofErr w:type="spellEnd"/>
-      <w:r>
-        <w:rPr>
-          <w:rFonts w:ascii="Consolas" w:hAnsi="Consolas"/>
-          <w:sz w:val="20"/>
-          <w:szCs w:val="28"/>
-          <w:lang w:val="en-US"/>
-        </w:rPr>
-        <w:t xml:space="preserve">_), size_ * </w:t>
-      </w:r>
-      <w:proofErr w:type="spellStart"/>
-      <w:r>
-        <w:rPr>
-          <w:rFonts w:ascii="Consolas" w:hAnsi="Consolas"/>
-          <w:sz w:val="20"/>
-          <w:szCs w:val="28"/>
-          <w:lang w:val="en-US"/>
-        </w:rPr>
-        <w:t>sizeof</w:t>
-      </w:r>
-      <w:proofErr w:type="spellEnd"/>
-      <w:r>
-        <w:rPr>
-          <w:rFonts w:ascii="Consolas" w:hAnsi="Consolas"/>
-          <w:sz w:val="20"/>
-          <w:szCs w:val="28"/>
-          <w:lang w:val="en-US"/>
-        </w:rPr>
-        <w:t>(T)));</w:t>
+        <w:t xml:space="preserve">    if (size_) CUDA_CHECK(cudaMalloc(reinterpret_cast&lt;void**&gt;(&amp;ptr_), size_ * sizeof(T)));</w:t>
       </w:r>
       <w:r>
         <w:rPr>
@@ -1700,14 +1433,12 @@
       <w:r>
         <w:t xml:space="preserve">Представление </w:t>
       </w:r>
-      <w:proofErr w:type="spellStart"/>
       <w:r>
         <w:rPr>
           <w:spacing w:val="-2"/>
         </w:rPr>
         <w:t>MatrixView</w:t>
       </w:r>
-      <w:proofErr w:type="spellEnd"/>
     </w:p>
     <w:p>
       <w:pPr>
@@ -1729,103 +1460,12 @@
           <w:lang w:val="en-US"/>
         </w:rPr>
       </w:pPr>
-      <w:proofErr w:type="spellStart"/>
-      <w:r>
-        <w:rPr>
-          <w:sz w:val="28"/>
-          <w:szCs w:val="28"/>
-        </w:rPr>
-        <w:t>MatrixView</w:t>
-      </w:r>
-      <w:proofErr w:type="spellEnd"/>
-      <w:r>
-        <w:rPr>
-          <w:sz w:val="28"/>
-          <w:szCs w:val="28"/>
-        </w:rPr>
-        <w:t xml:space="preserve"> хранит </w:t>
-      </w:r>
-      <w:proofErr w:type="spellStart"/>
-      <w:r>
-        <w:rPr>
-          <w:sz w:val="28"/>
-          <w:szCs w:val="28"/>
-        </w:rPr>
-        <w:t>невладеющий</w:t>
-      </w:r>
-      <w:proofErr w:type="spellEnd"/>
-      <w:r>
-        <w:rPr>
-          <w:sz w:val="28"/>
-          <w:szCs w:val="28"/>
-        </w:rPr>
-        <w:t xml:space="preserve"> указатель и размеры матрицы. Элемент (i, j) расположен по индексу i · </w:t>
-      </w:r>
-      <w:proofErr w:type="spellStart"/>
-      <w:r>
-        <w:rPr>
-          <w:sz w:val="28"/>
-          <w:szCs w:val="28"/>
-        </w:rPr>
-        <w:t>ncols</w:t>
-      </w:r>
-      <w:proofErr w:type="spellEnd"/>
-      <w:r>
-        <w:rPr>
-          <w:sz w:val="28"/>
-          <w:szCs w:val="28"/>
-        </w:rPr>
-        <w:t xml:space="preserve"> + j, то есть используется </w:t>
-      </w:r>
-      <w:proofErr w:type="spellStart"/>
-      <w:r>
-        <w:rPr>
-          <w:sz w:val="28"/>
-          <w:szCs w:val="28"/>
-        </w:rPr>
-        <w:t>row-major</w:t>
-      </w:r>
-      <w:proofErr w:type="spellEnd"/>
-      <w:r>
-        <w:rPr>
-          <w:sz w:val="28"/>
-          <w:szCs w:val="28"/>
-        </w:rPr>
-        <w:t xml:space="preserve">. Объект не управляет памятью и передаётся в CUDA-ядро по значению. Для входных матриц используется </w:t>
-      </w:r>
-      <w:proofErr w:type="spellStart"/>
-      <w:proofErr w:type="gramStart"/>
-      <w:r>
-        <w:rPr>
-          <w:sz w:val="28"/>
-          <w:szCs w:val="28"/>
-        </w:rPr>
-        <w:t>MatrixView</w:t>
-      </w:r>
-      <w:proofErr w:type="spellEnd"/>
-      <w:r>
-        <w:rPr>
-          <w:sz w:val="28"/>
-          <w:szCs w:val="28"/>
-        </w:rPr>
-        <w:t>&lt;</w:t>
-      </w:r>
-      <w:proofErr w:type="spellStart"/>
-      <w:proofErr w:type="gramEnd"/>
-      <w:r>
-        <w:rPr>
-          <w:sz w:val="28"/>
-          <w:szCs w:val="28"/>
-        </w:rPr>
-        <w:t>const</w:t>
-      </w:r>
-      <w:proofErr w:type="spellEnd"/>
-      <w:r>
-        <w:rPr>
-          <w:sz w:val="28"/>
-          <w:szCs w:val="28"/>
-        </w:rPr>
-        <w:t xml:space="preserve"> T&gt;, запрещающий изменение исходных элементов через представление.</w:t>
+      <w:r>
+        <w:rPr>
+          <w:sz w:val="28"/>
+          <w:szCs w:val="28"/>
+        </w:rPr>
+        <w:t>MatrixView хранит невладеющий указатель и размеры матрицы. Элемент (i, j) расположен по индексу i · ncols + j, то есть используется row-major. Объект не управляет памятью и передаётся в CUDA-ядро по значению. Для входных матриц используется MatrixView&lt;const T&gt;, запрещающий изменение исходных элементов через представление.</w:t>
       </w:r>
     </w:p>
     <w:p>
@@ -1857,9 +1497,8 @@
           <w:szCs w:val="28"/>
           <w:lang w:val="en-US"/>
         </w:rPr>
-        <w:t xml:space="preserve">template&lt;class T&gt; class </w:t>
-      </w:r>
-      <w:proofErr w:type="spellStart"/>
+        <w:t>template&lt;class T&gt; class MatrixView {</w:t>
+      </w:r>
       <w:r>
         <w:rPr>
           <w:rFonts w:ascii="Consolas" w:hAnsi="Consolas"/>
@@ -1867,78 +1506,8 @@
           <w:szCs w:val="28"/>
           <w:lang w:val="en-US"/>
         </w:rPr>
-        <w:t>MatrixView</w:t>
-      </w:r>
-      <w:proofErr w:type="spellEnd"/>
-      <w:r>
-        <w:rPr>
-          <w:rFonts w:ascii="Consolas" w:hAnsi="Consolas"/>
-          <w:sz w:val="20"/>
-          <w:szCs w:val="28"/>
-          <w:lang w:val="en-US"/>
-        </w:rPr>
-        <w:t xml:space="preserve"> {</w:t>
-      </w:r>
-      <w:r>
-        <w:rPr>
-          <w:rFonts w:ascii="Consolas" w:hAnsi="Consolas"/>
-          <w:sz w:val="20"/>
-          <w:szCs w:val="28"/>
-          <w:lang w:val="en-US"/>
-        </w:rPr>
         <w:br/>
-        <w:t xml:space="preserve">    T* </w:t>
-      </w:r>
-      <w:proofErr w:type="spellStart"/>
-      <w:r>
-        <w:rPr>
-          <w:rFonts w:ascii="Consolas" w:hAnsi="Consolas"/>
-          <w:sz w:val="20"/>
-          <w:szCs w:val="28"/>
-          <w:lang w:val="en-US"/>
-        </w:rPr>
-        <w:t>ptr</w:t>
-      </w:r>
-      <w:proofErr w:type="spellEnd"/>
-      <w:r>
-        <w:rPr>
-          <w:rFonts w:ascii="Consolas" w:hAnsi="Consolas"/>
-          <w:sz w:val="20"/>
-          <w:szCs w:val="28"/>
-          <w:lang w:val="en-US"/>
-        </w:rPr>
-        <w:t xml:space="preserve">_; </w:t>
-      </w:r>
-      <w:proofErr w:type="gramStart"/>
-      <w:r>
-        <w:rPr>
-          <w:rFonts w:ascii="Consolas" w:hAnsi="Consolas"/>
-          <w:sz w:val="20"/>
-          <w:szCs w:val="28"/>
-          <w:lang w:val="en-US"/>
-        </w:rPr>
-        <w:t>std::</w:t>
-      </w:r>
-      <w:proofErr w:type="spellStart"/>
-      <w:proofErr w:type="gramEnd"/>
-      <w:r>
-        <w:rPr>
-          <w:rFonts w:ascii="Consolas" w:hAnsi="Consolas"/>
-          <w:sz w:val="20"/>
-          <w:szCs w:val="28"/>
-          <w:lang w:val="en-US"/>
-        </w:rPr>
-        <w:t>size_t</w:t>
-      </w:r>
-      <w:proofErr w:type="spellEnd"/>
-      <w:r>
-        <w:rPr>
-          <w:rFonts w:ascii="Consolas" w:hAnsi="Consolas"/>
-          <w:sz w:val="20"/>
-          <w:szCs w:val="28"/>
-          <w:lang w:val="en-US"/>
-        </w:rPr>
-        <w:t xml:space="preserve"> rows_, cols_;</w:t>
+        <w:t xml:space="preserve">    T* ptr_; std::size_t rows_, cols_;</w:t>
       </w:r>
       <w:r>
         <w:rPr>
@@ -1958,9 +1527,8 @@
           <w:lang w:val="en-US"/>
         </w:rPr>
         <w:br/>
-        <w:t xml:space="preserve">    __host__ __device__ T&amp; </w:t>
-      </w:r>
-      <w:proofErr w:type="gramStart"/>
+        <w:t xml:space="preserve">    __host__ __device__ T&amp; operator()(std::size_t r, std::size_t c) const {</w:t>
+      </w:r>
       <w:r>
         <w:rPr>
           <w:rFonts w:ascii="Consolas" w:hAnsi="Consolas"/>
@@ -1968,10 +1536,9 @@
           <w:szCs w:val="28"/>
           <w:lang w:val="en-US"/>
         </w:rPr>
-        <w:t>operator()(std::</w:t>
-      </w:r>
-      <w:proofErr w:type="spellStart"/>
-      <w:proofErr w:type="gramEnd"/>
+        <w:br/>
+        <w:t xml:space="preserve">        return ptr_[r * cols_ + c];</w:t>
+      </w:r>
       <w:r>
         <w:rPr>
           <w:rFonts w:ascii="Consolas" w:hAnsi="Consolas"/>
@@ -1979,111 +1546,9 @@
           <w:szCs w:val="28"/>
           <w:lang w:val="en-US"/>
         </w:rPr>
-        <w:t>size_t</w:t>
-      </w:r>
-      <w:proofErr w:type="spellEnd"/>
-      <w:r>
-        <w:rPr>
-          <w:rFonts w:ascii="Consolas" w:hAnsi="Consolas"/>
-          <w:sz w:val="20"/>
-          <w:szCs w:val="28"/>
-          <w:lang w:val="en-US"/>
-        </w:rPr>
-        <w:t xml:space="preserve"> r, </w:t>
-      </w:r>
-      <w:proofErr w:type="gramStart"/>
-      <w:r>
-        <w:rPr>
-          <w:rFonts w:ascii="Consolas" w:hAnsi="Consolas"/>
-          <w:sz w:val="20"/>
-          <w:szCs w:val="28"/>
-          <w:lang w:val="en-US"/>
-        </w:rPr>
-        <w:t>std::</w:t>
-      </w:r>
-      <w:proofErr w:type="spellStart"/>
-      <w:proofErr w:type="gramEnd"/>
-      <w:r>
-        <w:rPr>
-          <w:rFonts w:ascii="Consolas" w:hAnsi="Consolas"/>
-          <w:sz w:val="20"/>
-          <w:szCs w:val="28"/>
-          <w:lang w:val="en-US"/>
-        </w:rPr>
-        <w:t>size_t</w:t>
-      </w:r>
-      <w:proofErr w:type="spellEnd"/>
-      <w:r>
-        <w:rPr>
-          <w:rFonts w:ascii="Consolas" w:hAnsi="Consolas"/>
-          <w:sz w:val="20"/>
-          <w:szCs w:val="28"/>
-          <w:lang w:val="en-US"/>
-        </w:rPr>
-        <w:t xml:space="preserve"> c) const {</w:t>
-      </w:r>
-      <w:r>
-        <w:rPr>
-          <w:rFonts w:ascii="Consolas" w:hAnsi="Consolas"/>
-          <w:sz w:val="20"/>
-          <w:szCs w:val="28"/>
-          <w:lang w:val="en-US"/>
-        </w:rPr>
         <w:br/>
-        <w:t xml:space="preserve">        return </w:t>
-      </w:r>
-      <w:proofErr w:type="spellStart"/>
-      <w:r>
-        <w:rPr>
-          <w:rFonts w:ascii="Consolas" w:hAnsi="Consolas"/>
-          <w:sz w:val="20"/>
-          <w:szCs w:val="28"/>
-          <w:lang w:val="en-US"/>
-        </w:rPr>
-        <w:t>ptr</w:t>
-      </w:r>
-      <w:proofErr w:type="spellEnd"/>
-      <w:proofErr w:type="gramStart"/>
-      <w:r>
-        <w:rPr>
-          <w:rFonts w:ascii="Consolas" w:hAnsi="Consolas"/>
-          <w:sz w:val="20"/>
-          <w:szCs w:val="28"/>
-          <w:lang w:val="en-US"/>
-        </w:rPr>
-        <w:t>_[</w:t>
-      </w:r>
-      <w:proofErr w:type="gramEnd"/>
-      <w:r>
-        <w:rPr>
-          <w:rFonts w:ascii="Consolas" w:hAnsi="Consolas"/>
-          <w:sz w:val="20"/>
-          <w:szCs w:val="28"/>
-          <w:lang w:val="en-US"/>
-        </w:rPr>
-        <w:t>r * cols_ + c];</w:t>
-      </w:r>
-      <w:r>
-        <w:rPr>
-          <w:rFonts w:ascii="Consolas" w:hAnsi="Consolas"/>
-          <w:sz w:val="20"/>
-          <w:szCs w:val="28"/>
-          <w:lang w:val="en-US"/>
-        </w:rPr>
-        <w:br/>
-        <w:t xml:space="preserve">  </w:t>
-      </w:r>
-      <w:proofErr w:type="gramStart"/>
-      <w:r>
-        <w:rPr>
-          <w:rFonts w:ascii="Consolas" w:hAnsi="Consolas"/>
-          <w:sz w:val="20"/>
-          <w:szCs w:val="28"/>
-          <w:lang w:val="en-US"/>
-        </w:rPr>
-        <w:t xml:space="preserve">  }</w:t>
-      </w:r>
-      <w:proofErr w:type="gramEnd"/>
+        <w:t xml:space="preserve">    }</w:t>
+      </w:r>
       <w:r>
         <w:rPr>
           <w:rFonts w:ascii="Consolas" w:hAnsi="Consolas"/>
@@ -2154,59 +1619,7 @@
           <w:sz w:val="28"/>
           <w:szCs w:val="28"/>
         </w:rPr>
-        <w:t xml:space="preserve">Перед вычислением проверяется условие </w:t>
-      </w:r>
-      <w:proofErr w:type="spellStart"/>
-      <w:proofErr w:type="gramStart"/>
-      <w:r>
-        <w:rPr>
-          <w:sz w:val="28"/>
-          <w:szCs w:val="28"/>
-        </w:rPr>
-        <w:t>A.ncols</w:t>
-      </w:r>
-      <w:proofErr w:type="spellEnd"/>
-      <w:proofErr w:type="gramEnd"/>
-      <w:r>
-        <w:rPr>
-          <w:sz w:val="28"/>
-          <w:szCs w:val="28"/>
-        </w:rPr>
-        <w:t xml:space="preserve">() == </w:t>
-      </w:r>
-      <w:proofErr w:type="spellStart"/>
-      <w:proofErr w:type="gramStart"/>
-      <w:r>
-        <w:rPr>
-          <w:sz w:val="28"/>
-          <w:szCs w:val="28"/>
-        </w:rPr>
-        <w:t>B.nrows</w:t>
-      </w:r>
-      <w:proofErr w:type="spellEnd"/>
-      <w:proofErr w:type="gramEnd"/>
-      <w:r>
-        <w:rPr>
-          <w:sz w:val="28"/>
-          <w:szCs w:val="28"/>
-        </w:rPr>
-        <w:t xml:space="preserve">(). Создаётся матрица результата; при ненулевом размере запускается выбранное ядро, после чего </w:t>
-      </w:r>
-      <w:proofErr w:type="spellStart"/>
-      <w:r>
-        <w:rPr>
-          <w:sz w:val="28"/>
-          <w:szCs w:val="28"/>
-        </w:rPr>
-        <w:t>cudaDeviceSynchronize</w:t>
-      </w:r>
-      <w:proofErr w:type="spellEnd"/>
-      <w:r>
-        <w:rPr>
-          <w:sz w:val="28"/>
-          <w:szCs w:val="28"/>
-        </w:rPr>
-        <w:t xml:space="preserve"> ожидает завершения вычисления и позволяет обнаружить ошибки выполнения.</w:t>
+        <w:t>Перед вычислением проверяется условие A.ncols() == B.nrows(). Создаётся матрица результата; при ненулевом размере запускается выбранное ядро, после чего cudaDeviceSynchronize ожидает завершения вычисления и позволяет обнаружить ошибки выполнения.</w:t>
       </w:r>
     </w:p>
     <w:p>
@@ -2231,7 +1644,6 @@
           <w:lang w:val="en-US"/>
         </w:rPr>
       </w:pPr>
-      <w:proofErr w:type="spellStart"/>
       <w:r>
         <w:rPr>
           <w:rFonts w:ascii="Consolas" w:hAnsi="Consolas"/>
@@ -2239,77 +1651,7 @@
           <w:szCs w:val="28"/>
           <w:lang w:val="en-US"/>
         </w:rPr>
-        <w:t>enum</w:t>
-      </w:r>
-      <w:proofErr w:type="spellEnd"/>
-      <w:r>
-        <w:rPr>
-          <w:rFonts w:ascii="Consolas" w:hAnsi="Consolas"/>
-          <w:sz w:val="20"/>
-          <w:szCs w:val="28"/>
-          <w:lang w:val="en-US"/>
-        </w:rPr>
-        <w:t xml:space="preserve"> class </w:t>
-      </w:r>
-      <w:proofErr w:type="spellStart"/>
-      <w:r>
-        <w:rPr>
-          <w:rFonts w:ascii="Consolas" w:hAnsi="Consolas"/>
-          <w:sz w:val="20"/>
-          <w:szCs w:val="28"/>
-          <w:lang w:val="en-US"/>
-        </w:rPr>
-        <w:t>MatmulStrategy</w:t>
-      </w:r>
-      <w:proofErr w:type="spellEnd"/>
-      <w:r>
-        <w:rPr>
-          <w:rFonts w:ascii="Consolas" w:hAnsi="Consolas"/>
-          <w:sz w:val="20"/>
-          <w:szCs w:val="28"/>
-          <w:lang w:val="en-US"/>
-        </w:rPr>
-        <w:t xml:space="preserve"> </w:t>
-      </w:r>
-      <w:proofErr w:type="gramStart"/>
-      <w:r>
-        <w:rPr>
-          <w:rFonts w:ascii="Consolas" w:hAnsi="Consolas"/>
-          <w:sz w:val="20"/>
-          <w:szCs w:val="28"/>
-          <w:lang w:val="en-US"/>
-        </w:rPr>
-        <w:t>{ Naive</w:t>
-      </w:r>
-      <w:proofErr w:type="gramEnd"/>
-      <w:r>
-        <w:rPr>
-          <w:rFonts w:ascii="Consolas" w:hAnsi="Consolas"/>
-          <w:sz w:val="20"/>
-          <w:szCs w:val="28"/>
-          <w:lang w:val="en-US"/>
-        </w:rPr>
-        <w:t xml:space="preserve">, </w:t>
-      </w:r>
-      <w:proofErr w:type="spellStart"/>
-      <w:r>
-        <w:rPr>
-          <w:rFonts w:ascii="Consolas" w:hAnsi="Consolas"/>
-          <w:sz w:val="20"/>
-          <w:szCs w:val="28"/>
-          <w:lang w:val="en-US"/>
-        </w:rPr>
-        <w:t>SharedMemory</w:t>
-      </w:r>
-      <w:proofErr w:type="spellEnd"/>
-      <w:r>
-        <w:rPr>
-          <w:rFonts w:ascii="Consolas" w:hAnsi="Consolas"/>
-          <w:sz w:val="20"/>
-          <w:szCs w:val="28"/>
-          <w:lang w:val="en-US"/>
-        </w:rPr>
-        <w:t xml:space="preserve"> };</w:t>
+        <w:t>enum class MatmulStrategy { Naive, SharedMemory };</w:t>
       </w:r>
       <w:r>
         <w:rPr>
@@ -2329,69 +1671,7 @@
           <w:lang w:val="en-US"/>
         </w:rPr>
         <w:br/>
-        <w:t xml:space="preserve">    return </w:t>
-      </w:r>
-      <w:proofErr w:type="gramStart"/>
-      <w:r>
-        <w:rPr>
-          <w:rFonts w:ascii="Consolas" w:hAnsi="Consolas"/>
-          <w:sz w:val="20"/>
-          <w:szCs w:val="28"/>
-          <w:lang w:val="en-US"/>
-        </w:rPr>
-        <w:t>multiply(</w:t>
-      </w:r>
-      <w:proofErr w:type="gramEnd"/>
-      <w:r>
-        <w:rPr>
-          <w:rFonts w:ascii="Consolas" w:hAnsi="Consolas"/>
-          <w:sz w:val="20"/>
-          <w:szCs w:val="28"/>
-          <w:lang w:val="en-US"/>
-        </w:rPr>
-        <w:t xml:space="preserve">a, b, </w:t>
-      </w:r>
-      <w:proofErr w:type="spellStart"/>
-      <w:proofErr w:type="gramStart"/>
-      <w:r>
-        <w:rPr>
-          <w:rFonts w:ascii="Consolas" w:hAnsi="Consolas"/>
-          <w:sz w:val="20"/>
-          <w:szCs w:val="28"/>
-          <w:lang w:val="en-US"/>
-        </w:rPr>
-        <w:t>MatmulStrategy</w:t>
-      </w:r>
-      <w:proofErr w:type="spellEnd"/>
-      <w:r>
-        <w:rPr>
-          <w:rFonts w:ascii="Consolas" w:hAnsi="Consolas"/>
-          <w:sz w:val="20"/>
-          <w:szCs w:val="28"/>
-          <w:lang w:val="en-US"/>
-        </w:rPr>
-        <w:t>::</w:t>
-      </w:r>
-      <w:proofErr w:type="spellStart"/>
-      <w:proofErr w:type="gramEnd"/>
-      <w:r>
-        <w:rPr>
-          <w:rFonts w:ascii="Consolas" w:hAnsi="Consolas"/>
-          <w:sz w:val="20"/>
-          <w:szCs w:val="28"/>
-          <w:lang w:val="en-US"/>
-        </w:rPr>
-        <w:t>SharedMemory</w:t>
-      </w:r>
-      <w:proofErr w:type="spellEnd"/>
-      <w:r>
-        <w:rPr>
-          <w:rFonts w:ascii="Consolas" w:hAnsi="Consolas"/>
-          <w:sz w:val="20"/>
-          <w:szCs w:val="28"/>
-          <w:lang w:val="en-US"/>
-        </w:rPr>
-        <w:t>);</w:t>
+        <w:t xml:space="preserve">    return multiply(a, b, MatmulStrategy::SharedMemory);</w:t>
       </w:r>
       <w:r>
         <w:rPr>
@@ -2419,23 +1699,7 @@
           <w:sz w:val="28"/>
           <w:szCs w:val="28"/>
         </w:rPr>
-        <w:t xml:space="preserve">Выбор стратегии отделяет интерфейс умножения от реализации алгоритма. </w:t>
-      </w:r>
-      <w:proofErr w:type="spellStart"/>
-      <w:r>
-        <w:rPr>
-          <w:sz w:val="28"/>
-          <w:szCs w:val="28"/>
-        </w:rPr>
-        <w:t>multiply_naive</w:t>
-      </w:r>
-      <w:proofErr w:type="spellEnd"/>
-      <w:r>
-        <w:rPr>
-          <w:sz w:val="28"/>
-          <w:szCs w:val="28"/>
-        </w:rPr>
-        <w:t xml:space="preserve"> оставлен для воспроизводимого сравнения с исходным подходом.</w:t>
+        <w:t>Выбор стратегии отделяет интерфейс умножения от реализации алгоритма. multiply_naive оставлен для воспроизводимого сравнения с исходным подходом.</w:t>
       </w:r>
     </w:p>
     <w:p>
@@ -2487,64 +1751,7 @@
           <w:sz w:val="28"/>
           <w:szCs w:val="28"/>
         </w:rPr>
-        <w:t xml:space="preserve">Блок из 256 нитей обрабатывает плитку результата 16 × 16. На каждой итерации цикла по внутреннему измерению потоки загружают фрагменты A и B в две плитки </w:t>
-      </w:r>
-      <w:proofErr w:type="spellStart"/>
-      <w:r>
-        <w:rPr>
-          <w:sz w:val="28"/>
-          <w:szCs w:val="28"/>
-        </w:rPr>
-        <w:t>shared</w:t>
-      </w:r>
-      <w:proofErr w:type="spellEnd"/>
-      <w:r>
-        <w:rPr>
-          <w:sz w:val="28"/>
-          <w:szCs w:val="28"/>
-        </w:rPr>
-        <w:t xml:space="preserve"> </w:t>
-      </w:r>
-      <w:proofErr w:type="spellStart"/>
-      <w:r>
-        <w:rPr>
-          <w:sz w:val="28"/>
-          <w:szCs w:val="28"/>
-        </w:rPr>
-        <w:t>memory</w:t>
-      </w:r>
-      <w:proofErr w:type="spellEnd"/>
-      <w:r>
-        <w:rPr>
-          <w:sz w:val="28"/>
-          <w:szCs w:val="28"/>
-        </w:rPr>
-        <w:t>. Для выходящих за границы элементов записываются нули. После загрузки вызывается __</w:t>
-      </w:r>
-      <w:proofErr w:type="spellStart"/>
-      <w:proofErr w:type="gramStart"/>
-      <w:r>
-        <w:rPr>
-          <w:sz w:val="28"/>
-          <w:szCs w:val="28"/>
-        </w:rPr>
-        <w:t>syncthreads</w:t>
-      </w:r>
-      <w:proofErr w:type="spellEnd"/>
-      <w:r>
-        <w:rPr>
-          <w:sz w:val="28"/>
-          <w:szCs w:val="28"/>
-        </w:rPr>
-        <w:t>(</w:t>
-      </w:r>
-      <w:proofErr w:type="gramEnd"/>
-      <w:r>
-        <w:rPr>
-          <w:sz w:val="28"/>
-          <w:szCs w:val="28"/>
-        </w:rPr>
-        <w:t>), затем каждая нить накапливает частичную сумму; повторная синхронизация защищает плитки перед следующей загрузкой.</w:t>
+        <w:t>Блок из 256 нитей обрабатывает плитку результата 16 × 16. На каждой итерации цикла по внутреннему измерению потоки загружают фрагменты A и B в две плитки shared memory. Для выходящих за границы элементов записываются нули. После загрузки вызывается __syncthreads(), затем каждая нить накапливает частичную сумму; повторная синхронизация защищает плитки перед следующей загрузкой.</w:t>
       </w:r>
     </w:p>
     <w:p>
@@ -2568,7 +1775,6 @@
           <w:lang w:val="en-US"/>
         </w:rPr>
       </w:pPr>
-      <w:proofErr w:type="spellStart"/>
       <w:r>
         <w:rPr>
           <w:rFonts w:ascii="Consolas" w:hAnsi="Consolas"/>
@@ -2576,9 +1782,8 @@
           <w:szCs w:val="28"/>
           <w:lang w:val="en-US"/>
         </w:rPr>
-        <w:t>tile_a</w:t>
-      </w:r>
-      <w:proofErr w:type="spellEnd"/>
+        <w:t>tile_a[ty][tx] = valid_a ? a(row, ak) : T{0};</w:t>
+      </w:r>
       <w:r>
         <w:rPr>
           <w:rFonts w:ascii="Consolas" w:hAnsi="Consolas"/>
@@ -2586,9 +1791,9 @@
           <w:szCs w:val="28"/>
           <w:lang w:val="en-US"/>
         </w:rPr>
-        <w:t>[ty][</w:t>
-      </w:r>
-      <w:proofErr w:type="spellStart"/>
+        <w:br/>
+        <w:t>tile_b[ty][tx] = valid_b ? b(bk, col) : T{0};</w:t>
+      </w:r>
       <w:r>
         <w:rPr>
           <w:rFonts w:ascii="Consolas" w:hAnsi="Consolas"/>
@@ -2596,258 +1801,8 @@
           <w:szCs w:val="28"/>
           <w:lang w:val="en-US"/>
         </w:rPr>
-        <w:t>tx</w:t>
-      </w:r>
-      <w:proofErr w:type="spellEnd"/>
-      <w:r>
-        <w:rPr>
-          <w:rFonts w:ascii="Consolas" w:hAnsi="Consolas"/>
-          <w:sz w:val="20"/>
-          <w:szCs w:val="28"/>
-          <w:lang w:val="en-US"/>
-        </w:rPr>
-        <w:t xml:space="preserve">] = </w:t>
-      </w:r>
-      <w:proofErr w:type="spellStart"/>
-      <w:r>
-        <w:rPr>
-          <w:rFonts w:ascii="Consolas" w:hAnsi="Consolas"/>
-          <w:sz w:val="20"/>
-          <w:szCs w:val="28"/>
-          <w:lang w:val="en-US"/>
-        </w:rPr>
-        <w:t>valid_a</w:t>
-      </w:r>
-      <w:proofErr w:type="spellEnd"/>
-      <w:r>
-        <w:rPr>
-          <w:rFonts w:ascii="Consolas" w:hAnsi="Consolas"/>
-          <w:sz w:val="20"/>
-          <w:szCs w:val="28"/>
-          <w:lang w:val="en-US"/>
-        </w:rPr>
-        <w:t xml:space="preserve"> ? </w:t>
-      </w:r>
-      <w:proofErr w:type="gramStart"/>
-      <w:r>
-        <w:rPr>
-          <w:rFonts w:ascii="Consolas" w:hAnsi="Consolas"/>
-          <w:sz w:val="20"/>
-          <w:szCs w:val="28"/>
-          <w:lang w:val="en-US"/>
-        </w:rPr>
-        <w:t>a(</w:t>
-      </w:r>
-      <w:proofErr w:type="gramEnd"/>
-      <w:r>
-        <w:rPr>
-          <w:rFonts w:ascii="Consolas" w:hAnsi="Consolas"/>
-          <w:sz w:val="20"/>
-          <w:szCs w:val="28"/>
-          <w:lang w:val="en-US"/>
-        </w:rPr>
-        <w:t xml:space="preserve">row, </w:t>
-      </w:r>
-      <w:proofErr w:type="spellStart"/>
-      <w:r>
-        <w:rPr>
-          <w:rFonts w:ascii="Consolas" w:hAnsi="Consolas"/>
-          <w:sz w:val="20"/>
-          <w:szCs w:val="28"/>
-          <w:lang w:val="en-US"/>
-        </w:rPr>
-        <w:t>ak</w:t>
-      </w:r>
-      <w:proofErr w:type="spellEnd"/>
-      <w:proofErr w:type="gramStart"/>
-      <w:r>
-        <w:rPr>
-          <w:rFonts w:ascii="Consolas" w:hAnsi="Consolas"/>
-          <w:sz w:val="20"/>
-          <w:szCs w:val="28"/>
-          <w:lang w:val="en-US"/>
-        </w:rPr>
-        <w:t>) :</w:t>
-      </w:r>
-      <w:proofErr w:type="gramEnd"/>
-      <w:r>
-        <w:rPr>
-          <w:rFonts w:ascii="Consolas" w:hAnsi="Consolas"/>
-          <w:sz w:val="20"/>
-          <w:szCs w:val="28"/>
-          <w:lang w:val="en-US"/>
-        </w:rPr>
-        <w:t xml:space="preserve"> T{0};</w:t>
-      </w:r>
-      <w:r>
-        <w:rPr>
-          <w:rFonts w:ascii="Consolas" w:hAnsi="Consolas"/>
-          <w:sz w:val="20"/>
-          <w:szCs w:val="28"/>
-          <w:lang w:val="en-US"/>
-        </w:rPr>
         <w:br/>
-      </w:r>
-      <w:proofErr w:type="spellStart"/>
-      <w:r>
-        <w:rPr>
-          <w:rFonts w:ascii="Consolas" w:hAnsi="Consolas"/>
-          <w:sz w:val="20"/>
-          <w:szCs w:val="28"/>
-          <w:lang w:val="en-US"/>
-        </w:rPr>
-        <w:t>tile_b</w:t>
-      </w:r>
-      <w:proofErr w:type="spellEnd"/>
-      <w:r>
-        <w:rPr>
-          <w:rFonts w:ascii="Consolas" w:hAnsi="Consolas"/>
-          <w:sz w:val="20"/>
-          <w:szCs w:val="28"/>
-          <w:lang w:val="en-US"/>
-        </w:rPr>
-        <w:t>[ty][</w:t>
-      </w:r>
-      <w:proofErr w:type="spellStart"/>
-      <w:r>
-        <w:rPr>
-          <w:rFonts w:ascii="Consolas" w:hAnsi="Consolas"/>
-          <w:sz w:val="20"/>
-          <w:szCs w:val="28"/>
-          <w:lang w:val="en-US"/>
-        </w:rPr>
-        <w:t>tx</w:t>
-      </w:r>
-      <w:proofErr w:type="spellEnd"/>
-      <w:r>
-        <w:rPr>
-          <w:rFonts w:ascii="Consolas" w:hAnsi="Consolas"/>
-          <w:sz w:val="20"/>
-          <w:szCs w:val="28"/>
-          <w:lang w:val="en-US"/>
-        </w:rPr>
-        <w:t xml:space="preserve">] = </w:t>
-      </w:r>
-      <w:proofErr w:type="spellStart"/>
-      <w:r>
-        <w:rPr>
-          <w:rFonts w:ascii="Consolas" w:hAnsi="Consolas"/>
-          <w:sz w:val="20"/>
-          <w:szCs w:val="28"/>
-          <w:lang w:val="en-US"/>
-        </w:rPr>
-        <w:t>valid_</w:t>
-      </w:r>
-      <w:proofErr w:type="gramStart"/>
-      <w:r>
-        <w:rPr>
-          <w:rFonts w:ascii="Consolas" w:hAnsi="Consolas"/>
-          <w:sz w:val="20"/>
-          <w:szCs w:val="28"/>
-          <w:lang w:val="en-US"/>
-        </w:rPr>
-        <w:t>b</w:t>
-      </w:r>
-      <w:proofErr w:type="spellEnd"/>
-      <w:r>
-        <w:rPr>
-          <w:rFonts w:ascii="Consolas" w:hAnsi="Consolas"/>
-          <w:sz w:val="20"/>
-          <w:szCs w:val="28"/>
-          <w:lang w:val="en-US"/>
-        </w:rPr>
-        <w:t xml:space="preserve"> ?</w:t>
-      </w:r>
-      <w:proofErr w:type="gramEnd"/>
-      <w:r>
-        <w:rPr>
-          <w:rFonts w:ascii="Consolas" w:hAnsi="Consolas"/>
-          <w:sz w:val="20"/>
-          <w:szCs w:val="28"/>
-          <w:lang w:val="en-US"/>
-        </w:rPr>
-        <w:t xml:space="preserve"> </w:t>
-      </w:r>
-      <w:proofErr w:type="gramStart"/>
-      <w:r>
-        <w:rPr>
-          <w:rFonts w:ascii="Consolas" w:hAnsi="Consolas"/>
-          <w:sz w:val="20"/>
-          <w:szCs w:val="28"/>
-          <w:lang w:val="en-US"/>
-        </w:rPr>
-        <w:t>b(</w:t>
-      </w:r>
-      <w:proofErr w:type="gramEnd"/>
-      <w:r>
-        <w:rPr>
-          <w:rFonts w:ascii="Consolas" w:hAnsi="Consolas"/>
-          <w:sz w:val="20"/>
-          <w:szCs w:val="28"/>
-          <w:lang w:val="en-US"/>
-        </w:rPr>
-        <w:t>bk, col</w:t>
-      </w:r>
-      <w:proofErr w:type="gramStart"/>
-      <w:r>
-        <w:rPr>
-          <w:rFonts w:ascii="Consolas" w:hAnsi="Consolas"/>
-          <w:sz w:val="20"/>
-          <w:szCs w:val="28"/>
-          <w:lang w:val="en-US"/>
-        </w:rPr>
-        <w:t>) :</w:t>
-      </w:r>
-      <w:proofErr w:type="gramEnd"/>
-      <w:r>
-        <w:rPr>
-          <w:rFonts w:ascii="Consolas" w:hAnsi="Consolas"/>
-          <w:sz w:val="20"/>
-          <w:szCs w:val="28"/>
-          <w:lang w:val="en-US"/>
-        </w:rPr>
-        <w:t xml:space="preserve"> T{0};</w:t>
-      </w:r>
-      <w:r>
-        <w:rPr>
-          <w:rFonts w:ascii="Consolas" w:hAnsi="Consolas"/>
-          <w:sz w:val="20"/>
-          <w:szCs w:val="28"/>
-          <w:lang w:val="en-US"/>
-        </w:rPr>
-        <w:br/>
-        <w:t>__</w:t>
-      </w:r>
-      <w:proofErr w:type="spellStart"/>
-      <w:proofErr w:type="gramStart"/>
-      <w:r>
-        <w:rPr>
-          <w:rFonts w:ascii="Consolas" w:hAnsi="Consolas"/>
-          <w:sz w:val="20"/>
-          <w:szCs w:val="28"/>
-          <w:lang w:val="en-US"/>
-        </w:rPr>
-        <w:t>syncthreads</w:t>
-      </w:r>
-      <w:proofErr w:type="spellEnd"/>
-      <w:r>
-        <w:rPr>
-          <w:rFonts w:ascii="Consolas" w:hAnsi="Consolas"/>
-          <w:sz w:val="20"/>
-          <w:szCs w:val="28"/>
-          <w:lang w:val="en-US"/>
-        </w:rPr>
-        <w:t>(</w:t>
-      </w:r>
-      <w:proofErr w:type="gramEnd"/>
-      <w:r>
-        <w:rPr>
-          <w:rFonts w:ascii="Consolas" w:hAnsi="Consolas"/>
-          <w:sz w:val="20"/>
-          <w:szCs w:val="28"/>
-          <w:lang w:val="en-US"/>
-        </w:rPr>
-        <w:t>);</w:t>
+        <w:t>__syncthreads();</w:t>
       </w:r>
       <w:r>
         <w:rPr>
@@ -2877,9 +1832,8 @@
           <w:lang w:val="en-US"/>
         </w:rPr>
         <w:br/>
-        <w:t xml:space="preserve">    sum += </w:t>
-      </w:r>
-      <w:proofErr w:type="spellStart"/>
+        <w:t xml:space="preserve">    sum += tile_a[ty][j] * tile_b[j][tx];</w:t>
+      </w:r>
       <w:r>
         <w:rPr>
           <w:rFonts w:ascii="Consolas" w:hAnsi="Consolas"/>
@@ -2887,98 +1841,8 @@
           <w:szCs w:val="28"/>
           <w:lang w:val="en-US"/>
         </w:rPr>
-        <w:t>tile_a</w:t>
-      </w:r>
-      <w:proofErr w:type="spellEnd"/>
-      <w:r>
-        <w:rPr>
-          <w:rFonts w:ascii="Consolas" w:hAnsi="Consolas"/>
-          <w:sz w:val="20"/>
-          <w:szCs w:val="28"/>
-          <w:lang w:val="en-US"/>
-        </w:rPr>
-        <w:t xml:space="preserve">[ty][j] * </w:t>
-      </w:r>
-      <w:proofErr w:type="spellStart"/>
-      <w:r>
-        <w:rPr>
-          <w:rFonts w:ascii="Consolas" w:hAnsi="Consolas"/>
-          <w:sz w:val="20"/>
-          <w:szCs w:val="28"/>
-          <w:lang w:val="en-US"/>
-        </w:rPr>
-        <w:t>tile_b</w:t>
-      </w:r>
-      <w:proofErr w:type="spellEnd"/>
-      <w:r>
-        <w:rPr>
-          <w:rFonts w:ascii="Consolas" w:hAnsi="Consolas"/>
-          <w:sz w:val="20"/>
-          <w:szCs w:val="28"/>
-          <w:lang w:val="en-US"/>
-        </w:rPr>
-        <w:t>[j][</w:t>
-      </w:r>
-      <w:proofErr w:type="spellStart"/>
-      <w:r>
-        <w:rPr>
-          <w:rFonts w:ascii="Consolas" w:hAnsi="Consolas"/>
-          <w:sz w:val="20"/>
-          <w:szCs w:val="28"/>
-          <w:lang w:val="en-US"/>
-        </w:rPr>
-        <w:t>tx</w:t>
-      </w:r>
-      <w:proofErr w:type="spellEnd"/>
-      <w:r>
-        <w:rPr>
-          <w:rFonts w:ascii="Consolas" w:hAnsi="Consolas"/>
-          <w:sz w:val="20"/>
-          <w:szCs w:val="28"/>
-          <w:lang w:val="en-US"/>
-        </w:rPr>
-        <w:t>];</w:t>
-      </w:r>
-      <w:r>
-        <w:rPr>
-          <w:rFonts w:ascii="Consolas" w:hAnsi="Consolas"/>
-          <w:sz w:val="20"/>
-          <w:szCs w:val="28"/>
-          <w:lang w:val="en-US"/>
-        </w:rPr>
         <w:br/>
-        <w:t>__</w:t>
-      </w:r>
-      <w:proofErr w:type="spellStart"/>
-      <w:proofErr w:type="gramStart"/>
-      <w:r>
-        <w:rPr>
-          <w:rFonts w:ascii="Consolas" w:hAnsi="Consolas"/>
-          <w:sz w:val="20"/>
-          <w:szCs w:val="28"/>
-          <w:lang w:val="en-US"/>
-        </w:rPr>
-        <w:t>syncthreads</w:t>
-      </w:r>
-      <w:proofErr w:type="spellEnd"/>
-      <w:r>
-        <w:rPr>
-          <w:rFonts w:ascii="Consolas" w:hAnsi="Consolas"/>
-          <w:sz w:val="20"/>
-          <w:szCs w:val="28"/>
-          <w:lang w:val="en-US"/>
-        </w:rPr>
-        <w:t>(</w:t>
-      </w:r>
-      <w:proofErr w:type="gramEnd"/>
-      <w:r>
-        <w:rPr>
-          <w:rFonts w:ascii="Consolas" w:hAnsi="Consolas"/>
-          <w:sz w:val="20"/>
-          <w:szCs w:val="28"/>
-          <w:lang w:val="en-US"/>
-        </w:rPr>
-        <w:t>);</w:t>
+        <w:t>__syncthreads();</w:t>
       </w:r>
     </w:p>
     <w:p>
@@ -3057,89 +1921,7 @@
           <w:sz w:val="28"/>
           <w:szCs w:val="28"/>
         </w:rPr>
-        <w:t xml:space="preserve">Google Test строит декартово произведение трёх наборов размеров через </w:t>
-      </w:r>
-      <w:proofErr w:type="spellStart"/>
-      <w:r>
-        <w:rPr>
-          <w:sz w:val="28"/>
-          <w:szCs w:val="28"/>
-        </w:rPr>
-        <w:t>Combine</w:t>
-      </w:r>
-      <w:proofErr w:type="spellEnd"/>
-      <w:r>
-        <w:rPr>
-          <w:sz w:val="28"/>
-          <w:szCs w:val="28"/>
-        </w:rPr>
-        <w:t xml:space="preserve">. Эталонный результат вычисляется с помощью </w:t>
-      </w:r>
-      <w:proofErr w:type="spellStart"/>
-      <w:proofErr w:type="gramStart"/>
-      <w:r>
-        <w:rPr>
-          <w:sz w:val="28"/>
-          <w:szCs w:val="28"/>
-        </w:rPr>
-        <w:t>Eigen</w:t>
-      </w:r>
-      <w:proofErr w:type="spellEnd"/>
-      <w:r>
-        <w:rPr>
-          <w:sz w:val="28"/>
-          <w:szCs w:val="28"/>
-        </w:rPr>
-        <w:t>::</w:t>
-      </w:r>
-      <w:proofErr w:type="spellStart"/>
-      <w:proofErr w:type="gramEnd"/>
-      <w:r>
-        <w:rPr>
-          <w:sz w:val="28"/>
-          <w:szCs w:val="28"/>
-        </w:rPr>
-        <w:t>MatrixXf</w:t>
-      </w:r>
-      <w:proofErr w:type="spellEnd"/>
-      <w:r>
-        <w:rPr>
-          <w:sz w:val="28"/>
-          <w:szCs w:val="28"/>
-        </w:rPr>
-        <w:t xml:space="preserve">. Входные матрицы хранятся в </w:t>
-      </w:r>
-      <w:proofErr w:type="spellStart"/>
-      <w:r>
-        <w:rPr>
-          <w:sz w:val="28"/>
-          <w:szCs w:val="28"/>
-        </w:rPr>
-        <w:t>row-major</w:t>
-      </w:r>
-      <w:proofErr w:type="spellEnd"/>
-      <w:r>
-        <w:rPr>
-          <w:sz w:val="28"/>
-          <w:szCs w:val="28"/>
-        </w:rPr>
-        <w:t xml:space="preserve">, что согласуется с раскладкой </w:t>
-      </w:r>
-      <w:proofErr w:type="spellStart"/>
-      <w:r>
-        <w:rPr>
-          <w:sz w:val="28"/>
-          <w:szCs w:val="28"/>
-        </w:rPr>
-        <w:t>MatrixView</w:t>
-      </w:r>
-      <w:proofErr w:type="spellEnd"/>
-      <w:r>
-        <w:rPr>
-          <w:sz w:val="28"/>
-          <w:szCs w:val="28"/>
-        </w:rPr>
-        <w:t>.</w:t>
+        <w:t>Google Test строит декартово произведение трёх наборов размеров через Combine. Эталонный результат вычисляется с помощью Eigen::MatrixXf. Входные матрицы хранятся в row-major, что согласуется с раскладкой MatrixView.</w:t>
       </w:r>
     </w:p>
     <w:p>
@@ -3164,7 +1946,6 @@
           <w:lang w:val="en-US"/>
         </w:rPr>
       </w:pPr>
-      <w:proofErr w:type="gramStart"/>
       <w:r>
         <w:rPr>
           <w:rFonts w:ascii="Consolas" w:hAnsi="Consolas"/>
@@ -3172,10 +1953,8 @@
           <w:szCs w:val="28"/>
           <w:lang w:val="en-US"/>
         </w:rPr>
-        <w:t>Eigen::</w:t>
-      </w:r>
-      <w:proofErr w:type="spellStart"/>
-      <w:proofErr w:type="gramEnd"/>
+        <w:t>Eigen::MatrixXf expected = Eigen::MatrixXf(ar) * Eigen::MatrixXf(br);</w:t>
+      </w:r>
       <w:r>
         <w:rPr>
           <w:rFonts w:ascii="Consolas" w:hAnsi="Consolas"/>
@@ -3183,9 +1962,9 @@
           <w:szCs w:val="28"/>
           <w:lang w:val="en-US"/>
         </w:rPr>
-        <w:t>MatrixXf</w:t>
-      </w:r>
-      <w:proofErr w:type="spellEnd"/>
+        <w:br/>
+        <w:t>Matrix&lt;float&gt; a(m, k), b(k, n);</w:t>
+      </w:r>
       <w:r>
         <w:rPr>
           <w:rFonts w:ascii="Consolas" w:hAnsi="Consolas"/>
@@ -3193,9 +1972,9 @@
           <w:szCs w:val="28"/>
           <w:lang w:val="en-US"/>
         </w:rPr>
-        <w:t xml:space="preserve"> expected = </w:t>
-      </w:r>
-      <w:proofErr w:type="gramStart"/>
+        <w:br/>
+        <w:t>a.data().copy_from_host(ar.data());</w:t>
+      </w:r>
       <w:r>
         <w:rPr>
           <w:rFonts w:ascii="Consolas" w:hAnsi="Consolas"/>
@@ -3203,347 +1982,8 @@
           <w:szCs w:val="28"/>
           <w:lang w:val="en-US"/>
         </w:rPr>
-        <w:t>Eigen::</w:t>
-      </w:r>
-      <w:proofErr w:type="spellStart"/>
-      <w:proofErr w:type="gramEnd"/>
-      <w:r>
-        <w:rPr>
-          <w:rFonts w:ascii="Consolas" w:hAnsi="Consolas"/>
-          <w:sz w:val="20"/>
-          <w:szCs w:val="28"/>
-          <w:lang w:val="en-US"/>
-        </w:rPr>
-        <w:t>MatrixXf</w:t>
-      </w:r>
-      <w:proofErr w:type="spellEnd"/>
-      <w:r>
-        <w:rPr>
-          <w:rFonts w:ascii="Consolas" w:hAnsi="Consolas"/>
-          <w:sz w:val="20"/>
-          <w:szCs w:val="28"/>
-          <w:lang w:val="en-US"/>
-        </w:rPr>
-        <w:t>(</w:t>
-      </w:r>
-      <w:proofErr w:type="spellStart"/>
-      <w:r>
-        <w:rPr>
-          <w:rFonts w:ascii="Consolas" w:hAnsi="Consolas"/>
-          <w:sz w:val="20"/>
-          <w:szCs w:val="28"/>
-          <w:lang w:val="en-US"/>
-        </w:rPr>
-        <w:t>ar</w:t>
-      </w:r>
-      <w:proofErr w:type="spellEnd"/>
-      <w:r>
-        <w:rPr>
-          <w:rFonts w:ascii="Consolas" w:hAnsi="Consolas"/>
-          <w:sz w:val="20"/>
-          <w:szCs w:val="28"/>
-          <w:lang w:val="en-US"/>
-        </w:rPr>
-        <w:t xml:space="preserve">) * </w:t>
-      </w:r>
-      <w:proofErr w:type="gramStart"/>
-      <w:r>
-        <w:rPr>
-          <w:rFonts w:ascii="Consolas" w:hAnsi="Consolas"/>
-          <w:sz w:val="20"/>
-          <w:szCs w:val="28"/>
-          <w:lang w:val="en-US"/>
-        </w:rPr>
-        <w:t>Eigen::</w:t>
-      </w:r>
-      <w:proofErr w:type="spellStart"/>
-      <w:proofErr w:type="gramEnd"/>
-      <w:r>
-        <w:rPr>
-          <w:rFonts w:ascii="Consolas" w:hAnsi="Consolas"/>
-          <w:sz w:val="20"/>
-          <w:szCs w:val="28"/>
-          <w:lang w:val="en-US"/>
-        </w:rPr>
-        <w:t>MatrixXf</w:t>
-      </w:r>
-      <w:proofErr w:type="spellEnd"/>
-      <w:r>
-        <w:rPr>
-          <w:rFonts w:ascii="Consolas" w:hAnsi="Consolas"/>
-          <w:sz w:val="20"/>
-          <w:szCs w:val="28"/>
-          <w:lang w:val="en-US"/>
-        </w:rPr>
-        <w:t>(</w:t>
-      </w:r>
-      <w:proofErr w:type="spellStart"/>
-      <w:r>
-        <w:rPr>
-          <w:rFonts w:ascii="Consolas" w:hAnsi="Consolas"/>
-          <w:sz w:val="20"/>
-          <w:szCs w:val="28"/>
-          <w:lang w:val="en-US"/>
-        </w:rPr>
-        <w:t>br</w:t>
-      </w:r>
-      <w:proofErr w:type="spellEnd"/>
-      <w:r>
-        <w:rPr>
-          <w:rFonts w:ascii="Consolas" w:hAnsi="Consolas"/>
-          <w:sz w:val="20"/>
-          <w:szCs w:val="28"/>
-          <w:lang w:val="en-US"/>
-        </w:rPr>
-        <w:t>);</w:t>
-      </w:r>
-      <w:r>
-        <w:rPr>
-          <w:rFonts w:ascii="Consolas" w:hAnsi="Consolas"/>
-          <w:sz w:val="20"/>
-          <w:szCs w:val="28"/>
-          <w:lang w:val="en-US"/>
-        </w:rPr>
         <w:br/>
-        <w:t xml:space="preserve">Matrix&lt;float&gt; </w:t>
-      </w:r>
-      <w:proofErr w:type="gramStart"/>
-      <w:r>
-        <w:rPr>
-          <w:rFonts w:ascii="Consolas" w:hAnsi="Consolas"/>
-          <w:sz w:val="20"/>
-          <w:szCs w:val="28"/>
-          <w:lang w:val="en-US"/>
-        </w:rPr>
-        <w:t>a(</w:t>
-      </w:r>
-      <w:proofErr w:type="gramEnd"/>
-      <w:r>
-        <w:rPr>
-          <w:rFonts w:ascii="Consolas" w:hAnsi="Consolas"/>
-          <w:sz w:val="20"/>
-          <w:szCs w:val="28"/>
-          <w:lang w:val="en-US"/>
-        </w:rPr>
-        <w:t xml:space="preserve">m, k), </w:t>
-      </w:r>
-      <w:proofErr w:type="gramStart"/>
-      <w:r>
-        <w:rPr>
-          <w:rFonts w:ascii="Consolas" w:hAnsi="Consolas"/>
-          <w:sz w:val="20"/>
-          <w:szCs w:val="28"/>
-          <w:lang w:val="en-US"/>
-        </w:rPr>
-        <w:t>b(</w:t>
-      </w:r>
-      <w:proofErr w:type="gramEnd"/>
-      <w:r>
-        <w:rPr>
-          <w:rFonts w:ascii="Consolas" w:hAnsi="Consolas"/>
-          <w:sz w:val="20"/>
-          <w:szCs w:val="28"/>
-          <w:lang w:val="en-US"/>
-        </w:rPr>
-        <w:t>k, n);</w:t>
-      </w:r>
-      <w:r>
-        <w:rPr>
-          <w:rFonts w:ascii="Consolas" w:hAnsi="Consolas"/>
-          <w:sz w:val="20"/>
-          <w:szCs w:val="28"/>
-          <w:lang w:val="en-US"/>
-        </w:rPr>
-        <w:br/>
-      </w:r>
-      <w:proofErr w:type="spellStart"/>
-      <w:r>
-        <w:rPr>
-          <w:rFonts w:ascii="Consolas" w:hAnsi="Consolas"/>
-          <w:sz w:val="20"/>
-          <w:szCs w:val="28"/>
-          <w:lang w:val="en-US"/>
-        </w:rPr>
-        <w:t>a.data</w:t>
-      </w:r>
-      <w:proofErr w:type="spellEnd"/>
-      <w:r>
-        <w:rPr>
-          <w:rFonts w:ascii="Consolas" w:hAnsi="Consolas"/>
-          <w:sz w:val="20"/>
-          <w:szCs w:val="28"/>
-          <w:lang w:val="en-US"/>
-        </w:rPr>
-        <w:t>(</w:t>
-      </w:r>
-      <w:proofErr w:type="gramStart"/>
-      <w:r>
-        <w:rPr>
-          <w:rFonts w:ascii="Consolas" w:hAnsi="Consolas"/>
-          <w:sz w:val="20"/>
-          <w:szCs w:val="28"/>
-          <w:lang w:val="en-US"/>
-        </w:rPr>
-        <w:t>).</w:t>
-      </w:r>
-      <w:proofErr w:type="spellStart"/>
-      <w:r>
-        <w:rPr>
-          <w:rFonts w:ascii="Consolas" w:hAnsi="Consolas"/>
-          <w:sz w:val="20"/>
-          <w:szCs w:val="28"/>
-          <w:lang w:val="en-US"/>
-        </w:rPr>
-        <w:t>copy</w:t>
-      </w:r>
-      <w:proofErr w:type="gramEnd"/>
-      <w:r>
-        <w:rPr>
-          <w:rFonts w:ascii="Consolas" w:hAnsi="Consolas"/>
-          <w:sz w:val="20"/>
-          <w:szCs w:val="28"/>
-          <w:lang w:val="en-US"/>
-        </w:rPr>
-        <w:t>_from_host</w:t>
-      </w:r>
-      <w:proofErr w:type="spellEnd"/>
-      <w:r>
-        <w:rPr>
-          <w:rFonts w:ascii="Consolas" w:hAnsi="Consolas"/>
-          <w:sz w:val="20"/>
-          <w:szCs w:val="28"/>
-          <w:lang w:val="en-US"/>
-        </w:rPr>
-        <w:t>(</w:t>
-      </w:r>
-      <w:proofErr w:type="spellStart"/>
-      <w:r>
-        <w:rPr>
-          <w:rFonts w:ascii="Consolas" w:hAnsi="Consolas"/>
-          <w:sz w:val="20"/>
-          <w:szCs w:val="28"/>
-          <w:lang w:val="en-US"/>
-        </w:rPr>
-        <w:t>ar.data</w:t>
-      </w:r>
-      <w:proofErr w:type="spellEnd"/>
-      <w:r>
-        <w:rPr>
-          <w:rFonts w:ascii="Consolas" w:hAnsi="Consolas"/>
-          <w:sz w:val="20"/>
-          <w:szCs w:val="28"/>
-          <w:lang w:val="en-US"/>
-        </w:rPr>
-        <w:t>());</w:t>
-      </w:r>
-      <w:r>
-        <w:rPr>
-          <w:rFonts w:ascii="Consolas" w:hAnsi="Consolas"/>
-          <w:sz w:val="20"/>
-          <w:szCs w:val="28"/>
-          <w:lang w:val="en-US"/>
-        </w:rPr>
-        <w:br/>
-      </w:r>
-      <w:proofErr w:type="spellStart"/>
-      <w:r>
-        <w:rPr>
-          <w:rFonts w:ascii="Consolas" w:hAnsi="Consolas"/>
-          <w:sz w:val="20"/>
-          <w:szCs w:val="28"/>
-          <w:lang w:val="en-US"/>
-        </w:rPr>
-        <w:t>b.data</w:t>
-      </w:r>
-      <w:proofErr w:type="spellEnd"/>
-      <w:r>
-        <w:rPr>
-          <w:rFonts w:ascii="Consolas" w:hAnsi="Consolas"/>
-          <w:sz w:val="20"/>
-          <w:szCs w:val="28"/>
-          <w:lang w:val="en-US"/>
-        </w:rPr>
-        <w:t>(</w:t>
-      </w:r>
-      <w:proofErr w:type="gramStart"/>
-      <w:r>
-        <w:rPr>
-          <w:rFonts w:ascii="Consolas" w:hAnsi="Consolas"/>
-          <w:sz w:val="20"/>
-          <w:szCs w:val="28"/>
-          <w:lang w:val="en-US"/>
-        </w:rPr>
-        <w:t>).</w:t>
-      </w:r>
-      <w:proofErr w:type="spellStart"/>
-      <w:r>
-        <w:rPr>
-          <w:rFonts w:ascii="Consolas" w:hAnsi="Consolas"/>
-          <w:sz w:val="20"/>
-          <w:szCs w:val="28"/>
-          <w:lang w:val="en-US"/>
-        </w:rPr>
-        <w:t>copy</w:t>
-      </w:r>
-      <w:proofErr w:type="gramEnd"/>
-      <w:r>
-        <w:rPr>
-          <w:rFonts w:ascii="Consolas" w:hAnsi="Consolas"/>
-          <w:sz w:val="20"/>
-          <w:szCs w:val="28"/>
-          <w:lang w:val="en-US"/>
-        </w:rPr>
-        <w:t>_from_host</w:t>
-      </w:r>
-      <w:proofErr w:type="spellEnd"/>
-      <w:r>
-        <w:rPr>
-          <w:rFonts w:ascii="Consolas" w:hAnsi="Consolas"/>
-          <w:sz w:val="20"/>
-          <w:szCs w:val="28"/>
-          <w:lang w:val="en-US"/>
-        </w:rPr>
-        <w:t>(</w:t>
-      </w:r>
-      <w:proofErr w:type="spellStart"/>
-      <w:r>
-        <w:rPr>
-          <w:rFonts w:ascii="Consolas" w:hAnsi="Consolas"/>
-          <w:sz w:val="20"/>
-          <w:szCs w:val="28"/>
-          <w:lang w:val="en-US"/>
-        </w:rPr>
-        <w:t>br.</w:t>
-      </w:r>
-      <w:proofErr w:type="gramStart"/>
-      <w:r>
-        <w:rPr>
-          <w:rFonts w:ascii="Consolas" w:hAnsi="Consolas"/>
-          <w:sz w:val="20"/>
-          <w:szCs w:val="28"/>
-          <w:lang w:val="en-US"/>
-        </w:rPr>
-        <w:t>data</w:t>
-      </w:r>
-      <w:proofErr w:type="spellEnd"/>
-      <w:r>
-        <w:rPr>
-          <w:rFonts w:ascii="Consolas" w:hAnsi="Consolas"/>
-          <w:sz w:val="20"/>
-          <w:szCs w:val="28"/>
-          <w:lang w:val="en-US"/>
-        </w:rPr>
-        <w:t>(</w:t>
-      </w:r>
-      <w:proofErr w:type="gramEnd"/>
-      <w:r>
-        <w:rPr>
-          <w:rFonts w:ascii="Consolas" w:hAnsi="Consolas"/>
-          <w:sz w:val="20"/>
-          <w:szCs w:val="28"/>
-          <w:lang w:val="en-US"/>
-        </w:rPr>
-        <w:t>));</w:t>
+        <w:t>b.data().copy_from_host(br.data());</w:t>
       </w:r>
       <w:r>
         <w:rPr>
@@ -3563,9 +2003,8 @@
           <w:lang w:val="en-US"/>
         </w:rPr>
         <w:br/>
-        <w:t>EXPECT_</w:t>
-      </w:r>
-      <w:proofErr w:type="gramStart"/>
+        <w:t>EXPECT_TRUE(actual.isApprox(expected, 1e-5f));</w:t>
+      </w:r>
       <w:r>
         <w:rPr>
           <w:rFonts w:ascii="Consolas" w:hAnsi="Consolas"/>
@@ -3573,120 +2012,8 @@
           <w:szCs w:val="28"/>
           <w:lang w:val="en-US"/>
         </w:rPr>
-        <w:t>TRUE(</w:t>
-      </w:r>
-      <w:proofErr w:type="spellStart"/>
-      <w:r>
-        <w:rPr>
-          <w:rFonts w:ascii="Consolas" w:hAnsi="Consolas"/>
-          <w:sz w:val="20"/>
-          <w:szCs w:val="28"/>
-          <w:lang w:val="en-US"/>
-        </w:rPr>
-        <w:t>actual.isApprox</w:t>
-      </w:r>
-      <w:proofErr w:type="spellEnd"/>
-      <w:proofErr w:type="gramEnd"/>
-      <w:r>
-        <w:rPr>
-          <w:rFonts w:ascii="Consolas" w:hAnsi="Consolas"/>
-          <w:sz w:val="20"/>
-          <w:szCs w:val="28"/>
-          <w:lang w:val="en-US"/>
-        </w:rPr>
-        <w:t>(expected, 1e-5f));</w:t>
-      </w:r>
-      <w:r>
-        <w:rPr>
-          <w:rFonts w:ascii="Consolas" w:hAnsi="Consolas"/>
-          <w:sz w:val="20"/>
-          <w:szCs w:val="28"/>
-          <w:lang w:val="en-US"/>
-        </w:rPr>
         <w:br/>
-        <w:t>EXPECT_</w:t>
-      </w:r>
-      <w:proofErr w:type="gramStart"/>
-      <w:r>
-        <w:rPr>
-          <w:rFonts w:ascii="Consolas" w:hAnsi="Consolas"/>
-          <w:sz w:val="20"/>
-          <w:szCs w:val="28"/>
-          <w:lang w:val="en-US"/>
-        </w:rPr>
-        <w:t>LE(</w:t>
-      </w:r>
-      <w:proofErr w:type="gramEnd"/>
-      <w:r>
-        <w:rPr>
-          <w:rFonts w:ascii="Consolas" w:hAnsi="Consolas"/>
-          <w:sz w:val="20"/>
-          <w:szCs w:val="28"/>
-          <w:lang w:val="en-US"/>
-        </w:rPr>
-        <w:t>(actual - expected</w:t>
-      </w:r>
-      <w:proofErr w:type="gramStart"/>
-      <w:r>
-        <w:rPr>
-          <w:rFonts w:ascii="Consolas" w:hAnsi="Consolas"/>
-          <w:sz w:val="20"/>
-          <w:szCs w:val="28"/>
-          <w:lang w:val="en-US"/>
-        </w:rPr>
-        <w:t>).</w:t>
-      </w:r>
-      <w:proofErr w:type="spellStart"/>
-      <w:r>
-        <w:rPr>
-          <w:rFonts w:ascii="Consolas" w:hAnsi="Consolas"/>
-          <w:sz w:val="20"/>
-          <w:szCs w:val="28"/>
-          <w:lang w:val="en-US"/>
-        </w:rPr>
-        <w:t>cwiseAbs</w:t>
-      </w:r>
-      <w:proofErr w:type="spellEnd"/>
-      <w:proofErr w:type="gramEnd"/>
-      <w:r>
-        <w:rPr>
-          <w:rFonts w:ascii="Consolas" w:hAnsi="Consolas"/>
-          <w:sz w:val="20"/>
-          <w:szCs w:val="28"/>
-          <w:lang w:val="en-US"/>
-        </w:rPr>
-        <w:t>(</w:t>
-      </w:r>
-      <w:proofErr w:type="gramStart"/>
-      <w:r>
-        <w:rPr>
-          <w:rFonts w:ascii="Consolas" w:hAnsi="Consolas"/>
-          <w:sz w:val="20"/>
-          <w:szCs w:val="28"/>
-          <w:lang w:val="en-US"/>
-        </w:rPr>
-        <w:t>).</w:t>
-      </w:r>
-      <w:proofErr w:type="spellStart"/>
-      <w:r>
-        <w:rPr>
-          <w:rFonts w:ascii="Consolas" w:hAnsi="Consolas"/>
-          <w:sz w:val="20"/>
-          <w:szCs w:val="28"/>
-          <w:lang w:val="en-US"/>
-        </w:rPr>
-        <w:t>maxCoeff</w:t>
-      </w:r>
-      <w:proofErr w:type="spellEnd"/>
-      <w:proofErr w:type="gramEnd"/>
-      <w:r>
-        <w:rPr>
-          <w:rFonts w:ascii="Consolas" w:hAnsi="Consolas"/>
-          <w:sz w:val="20"/>
-          <w:szCs w:val="28"/>
-          <w:lang w:val="en-US"/>
-        </w:rPr>
-        <w:t>(), 1e-5f);</w:t>
+        <w:t>EXPECT_LE((actual - expected).cwiseAbs().maxCoeff(), 1e-5f);</w:t>
       </w:r>
     </w:p>
     <w:p>
@@ -3717,21 +2044,12 @@
           <w:szCs w:val="28"/>
         </w:rPr>
       </w:pPr>
-      <w:proofErr w:type="spellStart"/>
-      <w:r>
-        <w:rPr>
-          <w:sz w:val="28"/>
-          <w:szCs w:val="28"/>
-        </w:rPr>
-        <w:t>isApprox</w:t>
-      </w:r>
-      <w:proofErr w:type="spellEnd"/>
-      <w:r>
-        <w:rPr>
-          <w:sz w:val="28"/>
-          <w:szCs w:val="28"/>
-        </w:rPr>
-        <w:t xml:space="preserve"> проверяет относительную близость норм, поэтому отдельно контролируется максимальная абсолютная погрешность не более 10⁻⁵.</w:t>
+      <w:r>
+        <w:rPr>
+          <w:sz w:val="28"/>
+          <w:szCs w:val="28"/>
+        </w:rPr>
+        <w:t>isApprox проверяет относительную близость норм, поэтому отдельно контролируется максимальная абсолютная погрешность не более 10⁻⁵.</w:t>
       </w:r>
     </w:p>
     <w:p>
@@ -3793,55 +2111,7 @@
           <w:sz w:val="28"/>
           <w:szCs w:val="28"/>
         </w:rPr>
-        <w:t xml:space="preserve">Измерения выполнены Google </w:t>
-      </w:r>
-      <w:proofErr w:type="spellStart"/>
-      <w:r>
-        <w:rPr>
-          <w:sz w:val="28"/>
-          <w:szCs w:val="28"/>
-        </w:rPr>
-        <w:t>Benchmark</w:t>
-      </w:r>
-      <w:proofErr w:type="spellEnd"/>
-      <w:r>
-        <w:rPr>
-          <w:sz w:val="28"/>
-          <w:szCs w:val="28"/>
-        </w:rPr>
-        <w:t xml:space="preserve"> в </w:t>
-      </w:r>
-      <w:proofErr w:type="spellStart"/>
-      <w:r>
-        <w:rPr>
-          <w:sz w:val="28"/>
-          <w:szCs w:val="28"/>
-        </w:rPr>
-        <w:t>Release</w:t>
-      </w:r>
-      <w:proofErr w:type="spellEnd"/>
-      <w:r>
-        <w:rPr>
-          <w:sz w:val="28"/>
-          <w:szCs w:val="28"/>
-        </w:rPr>
-        <w:t xml:space="preserve">-сборке. Для каждого размера проведены пять повторений; в таблице приведены медианные значения. Матрицы создаются и копируются на GPU до измеряемого интервала. CUDA </w:t>
-      </w:r>
-      <w:proofErr w:type="spellStart"/>
-      <w:r>
-        <w:rPr>
-          <w:sz w:val="28"/>
-          <w:szCs w:val="28"/>
-        </w:rPr>
-        <w:t>Events</w:t>
-      </w:r>
-      <w:proofErr w:type="spellEnd"/>
-      <w:r>
-        <w:rPr>
-          <w:sz w:val="28"/>
-          <w:szCs w:val="28"/>
-        </w:rPr>
-        <w:t xml:space="preserve"> измеряют выполнение ядра, поэтому выделение памяти результата и освобождение памяти не включены в измеряемый интервал.</w:t>
+        <w:t>Измерения выполнены Google Benchmark в Release-сборке. Для каждого размера проведены пять повторений; в таблице приведены медианные значения. Матрицы создаются и копируются на GPU до измеряемого интервала. CUDA Events измеряют выполнение ядра, поэтому выделение памяти результата и освобождение памяти не включены в измеряемый интервал.</w:t>
       </w:r>
     </w:p>
     <w:p>
@@ -3859,55 +2129,7 @@
           <w:sz w:val="28"/>
           <w:szCs w:val="28"/>
         </w:rPr>
-        <w:t xml:space="preserve">Перед измерениями выполняются </w:t>
-      </w:r>
-      <w:proofErr w:type="spellStart"/>
-      <w:r>
-        <w:rPr>
-          <w:sz w:val="28"/>
-          <w:szCs w:val="28"/>
-        </w:rPr>
-        <w:t>прогревочные</w:t>
-      </w:r>
-      <w:proofErr w:type="spellEnd"/>
-      <w:r>
-        <w:rPr>
-          <w:sz w:val="28"/>
-          <w:szCs w:val="28"/>
-        </w:rPr>
-        <w:t xml:space="preserve"> запуски. События CUDA синхронизируются перед считыванием </w:t>
-      </w:r>
-      <w:proofErr w:type="spellStart"/>
-      <w:r>
-        <w:rPr>
-          <w:sz w:val="28"/>
-          <w:szCs w:val="28"/>
-        </w:rPr>
-        <w:t>elapsed</w:t>
-      </w:r>
-      <w:proofErr w:type="spellEnd"/>
-      <w:r>
-        <w:rPr>
-          <w:sz w:val="28"/>
-          <w:szCs w:val="28"/>
-        </w:rPr>
-        <w:t xml:space="preserve"> </w:t>
-      </w:r>
-      <w:proofErr w:type="spellStart"/>
-      <w:r>
-        <w:rPr>
-          <w:sz w:val="28"/>
-          <w:szCs w:val="28"/>
-        </w:rPr>
-        <w:t>time</w:t>
-      </w:r>
-      <w:proofErr w:type="spellEnd"/>
-      <w:r>
-        <w:rPr>
-          <w:sz w:val="28"/>
-          <w:szCs w:val="28"/>
-        </w:rPr>
-        <w:t>. Измерения отражают время вычислительной части и не включают передачу исходных данных между CPU и GPU; полное время приложения будет больше.</w:t>
+        <w:t>Перед измерениями выполняются прогревочные запуски. События CUDA синхронизируются перед считыванием elapsed time. Измерения отражают время вычислительной части и не включают передачу исходных данных между CPU и GPU; полное время приложения будет больше.</w:t>
       </w:r>
     </w:p>
     <w:p>
@@ -3925,119 +2147,7 @@
           <w:sz w:val="28"/>
           <w:szCs w:val="28"/>
         </w:rPr>
-        <w:t xml:space="preserve">Среда эксперимента: NVIDIA GeForce RTX 2060, 6 </w:t>
-      </w:r>
-      <w:proofErr w:type="spellStart"/>
-      <w:r>
-        <w:rPr>
-          <w:sz w:val="28"/>
-          <w:szCs w:val="28"/>
-        </w:rPr>
-        <w:t>ГиБ</w:t>
-      </w:r>
-      <w:proofErr w:type="spellEnd"/>
-      <w:r>
-        <w:rPr>
-          <w:sz w:val="28"/>
-          <w:szCs w:val="28"/>
-        </w:rPr>
-        <w:t xml:space="preserve"> памяти; CUDA </w:t>
-      </w:r>
-      <w:proofErr w:type="spellStart"/>
-      <w:r>
-        <w:rPr>
-          <w:sz w:val="28"/>
-          <w:szCs w:val="28"/>
-        </w:rPr>
-        <w:t>Compiler</w:t>
-      </w:r>
-      <w:proofErr w:type="spellEnd"/>
-      <w:r>
-        <w:rPr>
-          <w:sz w:val="28"/>
-          <w:szCs w:val="28"/>
-        </w:rPr>
-        <w:t xml:space="preserve"> 13.0.88; NVIDIA Driver 595.79; CUDA </w:t>
-      </w:r>
-      <w:proofErr w:type="spellStart"/>
-      <w:r>
-        <w:rPr>
-          <w:sz w:val="28"/>
-          <w:szCs w:val="28"/>
-        </w:rPr>
-        <w:t>Version</w:t>
-      </w:r>
-      <w:proofErr w:type="spellEnd"/>
-      <w:r>
-        <w:rPr>
-          <w:sz w:val="28"/>
-          <w:szCs w:val="28"/>
-        </w:rPr>
-        <w:t xml:space="preserve">, указанная </w:t>
-      </w:r>
-      <w:proofErr w:type="spellStart"/>
-      <w:r>
-        <w:rPr>
-          <w:sz w:val="28"/>
-          <w:szCs w:val="28"/>
-        </w:rPr>
-        <w:t>nvidia-smi</w:t>
-      </w:r>
-      <w:proofErr w:type="spellEnd"/>
-      <w:r>
-        <w:rPr>
-          <w:sz w:val="28"/>
-          <w:szCs w:val="28"/>
-        </w:rPr>
-        <w:t xml:space="preserve">, — 13.2. Google </w:t>
-      </w:r>
-      <w:proofErr w:type="spellStart"/>
-      <w:r>
-        <w:rPr>
-          <w:sz w:val="28"/>
-          <w:szCs w:val="28"/>
-        </w:rPr>
-        <w:t>Benchmark</w:t>
-      </w:r>
-      <w:proofErr w:type="spellEnd"/>
-      <w:r>
-        <w:rPr>
-          <w:sz w:val="28"/>
-          <w:szCs w:val="28"/>
-        </w:rPr>
-        <w:t xml:space="preserve"> v1.9.1, </w:t>
-      </w:r>
-      <w:proofErr w:type="spellStart"/>
-      <w:r>
-        <w:rPr>
-          <w:sz w:val="28"/>
-          <w:szCs w:val="28"/>
-        </w:rPr>
-        <w:t>Release</w:t>
-      </w:r>
-      <w:proofErr w:type="spellEnd"/>
-      <w:r>
-        <w:rPr>
-          <w:sz w:val="28"/>
-          <w:szCs w:val="28"/>
-        </w:rPr>
-        <w:t xml:space="preserve">. В метаданных Google </w:t>
-      </w:r>
-      <w:proofErr w:type="spellStart"/>
-      <w:r>
-        <w:rPr>
-          <w:sz w:val="28"/>
-          <w:szCs w:val="28"/>
-        </w:rPr>
-        <w:t>Benchmark</w:t>
-      </w:r>
-      <w:proofErr w:type="spellEnd"/>
-      <w:r>
-        <w:rPr>
-          <w:sz w:val="28"/>
-          <w:szCs w:val="28"/>
-        </w:rPr>
-        <w:t xml:space="preserve"> указаны 12 логических процессоров и частота 3793 МГц.</w:t>
+        <w:t>Среда эксперимента: NVIDIA GeForce RTX 2060, 6 ГиБ памяти; CUDA Compiler 13.0.88; NVIDIA Driver 595.79; CUDA Version, указанная nvidia-smi, — 13.2. Google Benchmark v1.9.1, Release. В метаданных Google Benchmark указаны 12 логических процессоров и частота 3793 МГц.</w:t>
       </w:r>
     </w:p>
     <w:p>
@@ -4100,23 +2210,7 @@
           <w:sz w:val="28"/>
           <w:szCs w:val="28"/>
         </w:rPr>
-        <w:t xml:space="preserve">В таблице приведены медианы времени для двух CUDA-ядер и отношение времени наивного ядра к времени реализации с разделяемой памятью. Ускорение больше единицы означает преимущество </w:t>
-      </w:r>
-      <w:proofErr w:type="spellStart"/>
-      <w:r>
-        <w:rPr>
-          <w:sz w:val="28"/>
-          <w:szCs w:val="28"/>
-        </w:rPr>
-        <w:t>shared-memory</w:t>
-      </w:r>
-      <w:proofErr w:type="spellEnd"/>
-      <w:r>
-        <w:rPr>
-          <w:sz w:val="28"/>
-          <w:szCs w:val="28"/>
-        </w:rPr>
-        <w:t xml:space="preserve"> реализации.</w:t>
+        <w:t>В таблице приведены медианы времени для двух CUDA-ядер и отношение времени наивного ядра к времени реализации с разделяемой памятью. Ускорение больше единицы означает преимущество shared-memory реализации.</w:t>
       </w:r>
     </w:p>
     <w:p>
@@ -4232,37 +2326,12 @@
                 <w:szCs w:val="32"/>
               </w:rPr>
             </w:pPr>
-            <w:proofErr w:type="spellStart"/>
             <w:r>
               <w:rPr>
                 <w:sz w:val="28"/>
                 <w:szCs w:val="32"/>
               </w:rPr>
-              <w:t>Shared</w:t>
-            </w:r>
-            <w:proofErr w:type="spellEnd"/>
-            <w:r>
-              <w:rPr>
-                <w:sz w:val="28"/>
-                <w:szCs w:val="32"/>
-              </w:rPr>
-              <w:t xml:space="preserve"> </w:t>
-            </w:r>
-            <w:proofErr w:type="spellStart"/>
-            <w:r>
-              <w:rPr>
-                <w:sz w:val="28"/>
-                <w:szCs w:val="32"/>
-              </w:rPr>
-              <w:t>memory</w:t>
-            </w:r>
-            <w:proofErr w:type="spellEnd"/>
-            <w:r>
-              <w:rPr>
-                <w:sz w:val="28"/>
-                <w:szCs w:val="32"/>
-              </w:rPr>
-              <w:t>, мс</w:t>
+              <w:t>Shared memory, мс</w:t>
             </w:r>
           </w:p>
         </w:tc>
@@ -4975,55 +3044,7 @@
           <w:sz w:val="28"/>
           <w:szCs w:val="28"/>
         </w:rPr>
-        <w:t xml:space="preserve">Исходные значения измерений сохранены в </w:t>
-      </w:r>
-      <w:proofErr w:type="spellStart"/>
-      <w:r>
-        <w:rPr>
-          <w:sz w:val="28"/>
-          <w:szCs w:val="28"/>
-        </w:rPr>
-        <w:t>results</w:t>
-      </w:r>
-      <w:proofErr w:type="spellEnd"/>
-      <w:r>
-        <w:rPr>
-          <w:sz w:val="28"/>
-          <w:szCs w:val="28"/>
-        </w:rPr>
-        <w:t>/</w:t>
-      </w:r>
-      <w:proofErr w:type="spellStart"/>
-      <w:r>
-        <w:rPr>
-          <w:sz w:val="28"/>
-          <w:szCs w:val="28"/>
-        </w:rPr>
-        <w:t>benchmarks.json</w:t>
-      </w:r>
-      <w:proofErr w:type="spellEnd"/>
-      <w:r>
-        <w:rPr>
-          <w:sz w:val="28"/>
-          <w:szCs w:val="28"/>
-        </w:rPr>
-        <w:t xml:space="preserve"> и </w:t>
-      </w:r>
-      <w:proofErr w:type="spellStart"/>
-      <w:r>
-        <w:rPr>
-          <w:sz w:val="28"/>
-          <w:szCs w:val="28"/>
-        </w:rPr>
-        <w:t>results</w:t>
-      </w:r>
-      <w:proofErr w:type="spellEnd"/>
-      <w:r>
-        <w:rPr>
-          <w:sz w:val="28"/>
-          <w:szCs w:val="28"/>
-        </w:rPr>
-        <w:t>/measurements.csv. Графики построены скриптом plot.py на основании измеренных данных, а не на основе теоретических оценок.</w:t>
+        <w:t>Исходные значения измерений сохранены в results/benchmarks.json и results/measurements.csv. Графики построены скриптом plot.py на основании измеренных данных, а не на основе теоретических оценок.</w:t>
       </w:r>
     </w:p>
     <w:p>
@@ -5357,39 +3378,7 @@
           <w:sz w:val="28"/>
           <w:szCs w:val="28"/>
         </w:rPr>
-        <w:t xml:space="preserve">Теоретическая сложность умножения квадратных матриц равна Θ(n³). При удвоении n время для больших размеров растёт приблизительно в восемь раз. На интервале 256 → 512 отношение времени составляет около 6,69 для </w:t>
-      </w:r>
-      <w:proofErr w:type="spellStart"/>
-      <w:r>
-        <w:rPr>
-          <w:sz w:val="28"/>
-          <w:szCs w:val="28"/>
-        </w:rPr>
-        <w:t>shared</w:t>
-      </w:r>
-      <w:proofErr w:type="spellEnd"/>
-      <w:r>
-        <w:rPr>
-          <w:sz w:val="28"/>
-          <w:szCs w:val="28"/>
-        </w:rPr>
-        <w:t xml:space="preserve"> </w:t>
-      </w:r>
-      <w:proofErr w:type="spellStart"/>
-      <w:r>
-        <w:rPr>
-          <w:sz w:val="28"/>
-          <w:szCs w:val="28"/>
-        </w:rPr>
-        <w:t>memory</w:t>
-      </w:r>
-      <w:proofErr w:type="spellEnd"/>
-      <w:r>
-        <w:rPr>
-          <w:sz w:val="28"/>
-          <w:szCs w:val="28"/>
-        </w:rPr>
-        <w:t xml:space="preserve"> и 6,95 для наивного ядра; на интервале 512 → 1024 — около 7,84 и 8,02 соответственно. Эти значения приближаются к ожидаемому коэффициенту 8.</w:t>
+        <w:t>Теоретическая сложность умножения квадратных матриц равна Θ(n³). При удвоении n время для больших размеров растёт приблизительно в восемь раз. На интервале 256 → 512 отношение времени составляет около 6,69 для shared memory и 6,95 для наивного ядра; на интервале 512 → 1024 — около 7,84 и 8,02 соответственно. Эти значения приближаются к ожидаемому коэффициенту 8.</w:t>
       </w:r>
     </w:p>
     <w:p>
@@ -5459,55 +3448,7 @@
           <w:sz w:val="28"/>
           <w:szCs w:val="28"/>
         </w:rPr>
-        <w:t xml:space="preserve">Реализовано умножение матриц с применением </w:t>
-      </w:r>
-      <w:proofErr w:type="spellStart"/>
-      <w:r>
-        <w:rPr>
-          <w:sz w:val="28"/>
-          <w:szCs w:val="28"/>
-        </w:rPr>
-        <w:t>shared</w:t>
-      </w:r>
-      <w:proofErr w:type="spellEnd"/>
-      <w:r>
-        <w:rPr>
-          <w:sz w:val="28"/>
-          <w:szCs w:val="28"/>
-        </w:rPr>
-        <w:t xml:space="preserve"> </w:t>
-      </w:r>
-      <w:proofErr w:type="spellStart"/>
-      <w:r>
-        <w:rPr>
-          <w:sz w:val="28"/>
-          <w:szCs w:val="28"/>
-        </w:rPr>
-        <w:t>memory</w:t>
-      </w:r>
-      <w:proofErr w:type="spellEnd"/>
-      <w:r>
-        <w:rPr>
-          <w:sz w:val="28"/>
-          <w:szCs w:val="28"/>
-        </w:rPr>
-        <w:t xml:space="preserve"> и передачи </w:t>
-      </w:r>
-      <w:proofErr w:type="spellStart"/>
-      <w:r>
-        <w:rPr>
-          <w:sz w:val="28"/>
-          <w:szCs w:val="28"/>
-        </w:rPr>
-        <w:t>MatrixView</w:t>
-      </w:r>
-      <w:proofErr w:type="spellEnd"/>
-      <w:r>
-        <w:rPr>
-          <w:sz w:val="28"/>
-          <w:szCs w:val="28"/>
-        </w:rPr>
-        <w:t xml:space="preserve"> по значению. Протокол содержит 347 успешно завершённых тестов, включая все 343 заданные комбинации размеров. По измерениям на NVIDIA GeForce RTX 2060 разделяемая память не даёт преимущества для самых маленьких матриц, но обеспечивает ускорение на крупных размерах до 1,292 раза при n = 1024. Экспериментальные показатели для крупных матриц согласуются с теоретической сложностью Θ(n³).</w:t>
+        <w:t>Реализовано умножение матриц с применением shared memory и передачи MatrixView по значению. Протокол содержит 347 успешно завершённых тестов, включая все 343 заданные комбинации размеров. По измерениям на NVIDIA GeForce RTX 2060 разделяемая память не даёт преимущества для самых маленьких матриц, но обеспечивает ускорение на крупных размерах до 1,292 раза при n = 1024. Экспериментальные показатели для крупных матриц согласуются с теоретической сложностью Θ(n³).</w:t>
       </w:r>
     </w:p>
     <w:p>
@@ -6558,6 +4499,7 @@
   <w:style w:type="character" w:default="1" w:styleId="a0">
     <w:name w:val="Default Paragraph Font"/>
     <w:uiPriority w:val="1"/>
+    <w:semiHidden/>
     <w:unhideWhenUsed/>
   </w:style>
   <w:style w:type="table" w:default="1" w:styleId="a1">

</xml_diff>